<commit_message>
Site updated: 2021-12-20 19:15:33
</commit_message>
<xml_diff>
--- a/treasure/download/经藏/经集部-433部/新建文件夹/药师琉璃光如来本愿功德经-唐-玄奘.docx
+++ b/treasure/download/经藏/经集部-433部/新建文件夹/药师琉璃光如来本愿功德经-唐-玄奘.docx
@@ -4,7 +4,6 @@
   <w:body>
     <w:p>
       <w:pPr>
-        <w:jc w:val="center"/>
         <w:rPr>
           <w:rFonts w:ascii="楷体" w:eastAsia="楷体" w:hAnsi="楷体"/>
           <w:sz w:val="24"/>
@@ -24,98 +23,98 @@
     </w:p>
     <w:p>
       <w:pPr>
-        <w:jc w:val="center"/>
-        <w:rPr>
-          <w:rFonts w:ascii="楷体" w:eastAsia="楷体" w:hAnsi="楷体"/>
-          <w:sz w:val="24"/>
-          <w:szCs w:val="24"/>
-          <w:shd w:val="pct15" w:color="auto" w:fill="FFFFFF"/>
-        </w:rPr>
-      </w:pPr>
-      <w:r>
-        <w:rPr>
-          <w:rFonts w:ascii="楷体" w:eastAsia="楷体" w:hAnsi="楷体" w:hint="eastAsia"/>
-          <w:sz w:val="24"/>
-          <w:szCs w:val="24"/>
-          <w:shd w:val="pct15" w:color="auto" w:fill="FFFFFF"/>
-        </w:rPr>
-        <w:t>大唐三藏法师玄奘奉</w:t>
-      </w:r>
-      <w:r>
-        <w:rPr>
-          <w:rFonts w:ascii="楷体" w:eastAsia="楷体" w:hAnsi="楷体" w:hint="eastAsia"/>
-          <w:sz w:val="24"/>
-          <w:szCs w:val="24"/>
-          <w:shd w:val="pct15" w:color="auto" w:fill="FFFFFF"/>
-        </w:rPr>
-        <w:t xml:space="preserve"> </w:t>
-      </w:r>
-      <w:r>
-        <w:rPr>
-          <w:rFonts w:ascii="楷体" w:eastAsia="楷体" w:hAnsi="楷体" w:hint="eastAsia"/>
-          <w:sz w:val="24"/>
-          <w:szCs w:val="24"/>
-          <w:shd w:val="pct15" w:color="auto" w:fill="FFFFFF"/>
-        </w:rPr>
-        <w:t>诏译</w:t>
-      </w:r>
-    </w:p>
-    <w:p>
-      <w:pPr>
-        <w:rPr>
-          <w:rFonts w:ascii="楷体" w:eastAsia="楷体" w:hAnsi="楷体"/>
-          <w:sz w:val="24"/>
-          <w:szCs w:val="24"/>
-          <w:shd w:val="pct15" w:color="auto" w:fill="FFFFFF"/>
-        </w:rPr>
-      </w:pPr>
-      <w:r>
-        <w:rPr>
-          <w:rFonts w:ascii="楷体" w:eastAsia="楷体" w:hAnsi="楷体" w:hint="eastAsia"/>
-          <w:sz w:val="24"/>
-          <w:szCs w:val="24"/>
-          <w:shd w:val="pct15" w:color="auto" w:fill="FFFFFF"/>
-        </w:rPr>
-        <w:t xml:space="preserve">　　如是我闻。一时薄伽梵游化诸国</w:t>
-      </w:r>
-      <w:r>
-        <w:rPr>
-          <w:rFonts w:ascii="楷体" w:eastAsia="楷体" w:hAnsi="楷体" w:hint="eastAsia"/>
-          <w:sz w:val="24"/>
-          <w:szCs w:val="24"/>
-          <w:shd w:val="pct15" w:color="auto" w:fill="FFFFFF"/>
-        </w:rPr>
-        <w:t>。</w:t>
-      </w:r>
-      <w:r>
-        <w:rPr>
-          <w:rFonts w:ascii="楷体" w:eastAsia="楷体" w:hAnsi="楷体" w:hint="eastAsia"/>
-          <w:sz w:val="24"/>
-          <w:szCs w:val="24"/>
-          <w:shd w:val="pct15" w:color="auto" w:fill="FFFFFF"/>
-        </w:rPr>
-        <w:t>至广严城住乐音树下</w:t>
-      </w:r>
-      <w:r>
-        <w:rPr>
-          <w:rFonts w:ascii="楷体" w:eastAsia="楷体" w:hAnsi="楷体" w:hint="eastAsia"/>
-          <w:sz w:val="24"/>
-          <w:szCs w:val="24"/>
-          <w:shd w:val="pct15" w:color="auto" w:fill="FFFFFF"/>
-        </w:rPr>
-        <w:t>。</w:t>
-      </w:r>
-      <w:r>
-        <w:rPr>
-          <w:rFonts w:ascii="楷体" w:eastAsia="楷体" w:hAnsi="楷体" w:hint="eastAsia"/>
-          <w:sz w:val="24"/>
-          <w:szCs w:val="24"/>
-          <w:shd w:val="pct15" w:color="auto" w:fill="FFFFFF"/>
-        </w:rPr>
-        <w:t>与大苾刍众八千人俱。菩萨摩诃萨三万六千。及国王大臣婆罗门居士天龙药叉人非人等。无量大众恭敬围绕而为说法。</w:t>
-      </w:r>
+        <w:ind w:firstLineChars="200" w:firstLine="480"/>
+        <w:rPr>
+          <w:rFonts w:ascii="楷体" w:eastAsia="楷体" w:hAnsi="楷体"/>
+          <w:sz w:val="24"/>
+          <w:szCs w:val="24"/>
+          <w:shd w:val="pct15" w:color="auto" w:fill="FFFFFF"/>
+        </w:rPr>
+      </w:pPr>
       <w:bookmarkStart w:id="0" w:name="_GoBack"/>
       <w:bookmarkEnd w:id="0"/>
+      <w:r>
+        <w:rPr>
+          <w:rFonts w:ascii="楷体" w:eastAsia="楷体" w:hAnsi="楷体" w:hint="eastAsia"/>
+          <w:sz w:val="24"/>
+          <w:szCs w:val="24"/>
+          <w:shd w:val="pct15" w:color="auto" w:fill="FFFFFF"/>
+        </w:rPr>
+        <w:t>大唐三藏法师玄奘奉</w:t>
+      </w:r>
+      <w:r>
+        <w:rPr>
+          <w:rFonts w:ascii="楷体" w:eastAsia="楷体" w:hAnsi="楷体" w:hint="eastAsia"/>
+          <w:sz w:val="24"/>
+          <w:szCs w:val="24"/>
+          <w:shd w:val="pct15" w:color="auto" w:fill="FFFFFF"/>
+        </w:rPr>
+        <w:t xml:space="preserve"> </w:t>
+      </w:r>
+      <w:r>
+        <w:rPr>
+          <w:rFonts w:ascii="楷体" w:eastAsia="楷体" w:hAnsi="楷体" w:hint="eastAsia"/>
+          <w:sz w:val="24"/>
+          <w:szCs w:val="24"/>
+          <w:shd w:val="pct15" w:color="auto" w:fill="FFFFFF"/>
+        </w:rPr>
+        <w:t>诏译</w:t>
+      </w:r>
+    </w:p>
+    <w:p>
+      <w:pPr>
+        <w:rPr>
+          <w:rFonts w:ascii="楷体" w:eastAsia="楷体" w:hAnsi="楷体"/>
+          <w:sz w:val="24"/>
+          <w:szCs w:val="24"/>
+          <w:shd w:val="pct15" w:color="auto" w:fill="FFFFFF"/>
+        </w:rPr>
+      </w:pPr>
+      <w:r>
+        <w:rPr>
+          <w:rFonts w:ascii="楷体" w:eastAsia="楷体" w:hAnsi="楷体" w:hint="eastAsia"/>
+          <w:sz w:val="24"/>
+          <w:szCs w:val="24"/>
+          <w:shd w:val="pct15" w:color="auto" w:fill="FFFFFF"/>
+        </w:rPr>
+        <w:t xml:space="preserve">　　如是我闻。一时薄伽梵游化诸国</w:t>
+      </w:r>
+      <w:r>
+        <w:rPr>
+          <w:rFonts w:ascii="楷体" w:eastAsia="楷体" w:hAnsi="楷体" w:hint="eastAsia"/>
+          <w:sz w:val="24"/>
+          <w:szCs w:val="24"/>
+          <w:shd w:val="pct15" w:color="auto" w:fill="FFFFFF"/>
+        </w:rPr>
+        <w:t>。</w:t>
+      </w:r>
+      <w:r>
+        <w:rPr>
+          <w:rFonts w:ascii="楷体" w:eastAsia="楷体" w:hAnsi="楷体" w:hint="eastAsia"/>
+          <w:sz w:val="24"/>
+          <w:szCs w:val="24"/>
+          <w:shd w:val="pct15" w:color="auto" w:fill="FFFFFF"/>
+        </w:rPr>
+        <w:t>至广严城住乐音树下</w:t>
+      </w:r>
+      <w:r>
+        <w:rPr>
+          <w:rFonts w:ascii="楷体" w:eastAsia="楷体" w:hAnsi="楷体" w:hint="eastAsia"/>
+          <w:sz w:val="24"/>
+          <w:szCs w:val="24"/>
+          <w:shd w:val="pct15" w:color="auto" w:fill="FFFFFF"/>
+        </w:rPr>
+        <w:t>。</w:t>
+      </w:r>
+      <w:r>
+        <w:rPr>
+          <w:rFonts w:ascii="楷体" w:eastAsia="楷体" w:hAnsi="楷体" w:hint="eastAsia"/>
+          <w:sz w:val="24"/>
+          <w:szCs w:val="24"/>
+          <w:shd w:val="pct15" w:color="auto" w:fill="FFFFFF"/>
+        </w:rPr>
+        <w:t>与大苾刍众八千人俱。菩萨摩诃萨三万六千。及国王大臣婆罗门居士天龙药叉人非人等。无量大众恭敬围绕而为说法。</w:t>
+      </w:r>
     </w:p>
     <w:p>
       <w:pPr>

</xml_diff>

<commit_message>
Site updated: 2022-01-18 07:34:26
</commit_message>
<xml_diff>
--- a/treasure/download/经藏/经集部-433部/新建文件夹/药师琉璃光如来本愿功德经-唐-玄奘.docx
+++ b/treasure/download/经藏/经集部-433部/新建文件夹/药师琉璃光如来本愿功德经-唐-玄奘.docx
@@ -31,1066 +31,1120 @@
           <w:shd w:val="pct15" w:color="auto" w:fill="FFFFFF"/>
         </w:rPr>
       </w:pPr>
+      <w:r>
+        <w:rPr>
+          <w:rFonts w:ascii="楷体" w:eastAsia="楷体" w:hAnsi="楷体" w:hint="eastAsia"/>
+          <w:sz w:val="24"/>
+          <w:szCs w:val="24"/>
+          <w:shd w:val="pct15" w:color="auto" w:fill="FFFFFF"/>
+        </w:rPr>
+        <w:t>大唐三藏法师玄奘奉</w:t>
+      </w:r>
+      <w:r>
+        <w:rPr>
+          <w:rFonts w:ascii="楷体" w:eastAsia="楷体" w:hAnsi="楷体" w:hint="eastAsia"/>
+          <w:sz w:val="24"/>
+          <w:szCs w:val="24"/>
+          <w:shd w:val="pct15" w:color="auto" w:fill="FFFFFF"/>
+        </w:rPr>
+        <w:t xml:space="preserve"> </w:t>
+      </w:r>
+      <w:r>
+        <w:rPr>
+          <w:rFonts w:ascii="楷体" w:eastAsia="楷体" w:hAnsi="楷体" w:hint="eastAsia"/>
+          <w:sz w:val="24"/>
+          <w:szCs w:val="24"/>
+          <w:shd w:val="pct15" w:color="auto" w:fill="FFFFFF"/>
+        </w:rPr>
+        <w:t>诏译</w:t>
+      </w:r>
+    </w:p>
+    <w:p>
+      <w:pPr>
+        <w:rPr>
+          <w:rFonts w:ascii="楷体" w:eastAsia="楷体" w:hAnsi="楷体"/>
+          <w:sz w:val="24"/>
+          <w:szCs w:val="24"/>
+          <w:shd w:val="pct15" w:color="auto" w:fill="FFFFFF"/>
+        </w:rPr>
+      </w:pPr>
+      <w:r>
+        <w:rPr>
+          <w:rFonts w:ascii="楷体" w:eastAsia="楷体" w:hAnsi="楷体" w:hint="eastAsia"/>
+          <w:sz w:val="24"/>
+          <w:szCs w:val="24"/>
+          <w:shd w:val="pct15" w:color="auto" w:fill="FFFFFF"/>
+        </w:rPr>
+        <w:t xml:space="preserve">　　如是我闻。一时薄伽梵游化诸国</w:t>
+      </w:r>
+      <w:r>
+        <w:rPr>
+          <w:rFonts w:ascii="楷体" w:eastAsia="楷体" w:hAnsi="楷体" w:hint="eastAsia"/>
+          <w:sz w:val="24"/>
+          <w:szCs w:val="24"/>
+          <w:shd w:val="pct15" w:color="auto" w:fill="FFFFFF"/>
+        </w:rPr>
+        <w:t>。</w:t>
+      </w:r>
+      <w:r>
+        <w:rPr>
+          <w:rFonts w:ascii="楷体" w:eastAsia="楷体" w:hAnsi="楷体" w:hint="eastAsia"/>
+          <w:sz w:val="24"/>
+          <w:szCs w:val="24"/>
+          <w:shd w:val="pct15" w:color="auto" w:fill="FFFFFF"/>
+        </w:rPr>
+        <w:t>至广严城住乐音树下</w:t>
+      </w:r>
+      <w:r>
+        <w:rPr>
+          <w:rFonts w:ascii="楷体" w:eastAsia="楷体" w:hAnsi="楷体" w:hint="eastAsia"/>
+          <w:sz w:val="24"/>
+          <w:szCs w:val="24"/>
+          <w:shd w:val="pct15" w:color="auto" w:fill="FFFFFF"/>
+        </w:rPr>
+        <w:t>。</w:t>
+      </w:r>
+      <w:r>
+        <w:rPr>
+          <w:rFonts w:ascii="楷体" w:eastAsia="楷体" w:hAnsi="楷体" w:hint="eastAsia"/>
+          <w:sz w:val="24"/>
+          <w:szCs w:val="24"/>
+          <w:shd w:val="pct15" w:color="auto" w:fill="FFFFFF"/>
+        </w:rPr>
+        <w:t>与大苾刍众八千人俱。菩萨摩诃萨三万六千。及国王大臣婆罗门居士天龙药叉人非人等。无量大众恭敬围绕而为说法。</w:t>
+      </w:r>
+    </w:p>
+    <w:p>
+      <w:pPr>
+        <w:rPr>
+          <w:rFonts w:ascii="楷体" w:eastAsia="楷体" w:hAnsi="楷体"/>
+          <w:sz w:val="24"/>
+          <w:szCs w:val="24"/>
+          <w:shd w:val="pct15" w:color="auto" w:fill="FFFFFF"/>
+        </w:rPr>
+      </w:pPr>
+      <w:r>
+        <w:rPr>
+          <w:rFonts w:ascii="楷体" w:eastAsia="楷体" w:hAnsi="楷体" w:hint="eastAsia"/>
+          <w:sz w:val="24"/>
+          <w:szCs w:val="24"/>
+          <w:shd w:val="pct15" w:color="auto" w:fill="FFFFFF"/>
+        </w:rPr>
+        <w:t xml:space="preserve">　　尔时曼殊室利法王子承佛威神从座而起。偏袒一肩右膝著地。向薄伽梵曲躬合掌</w:t>
+      </w:r>
+      <w:r>
+        <w:rPr>
+          <w:rFonts w:ascii="楷体" w:eastAsia="楷体" w:hAnsi="楷体" w:hint="eastAsia"/>
+          <w:sz w:val="24"/>
+          <w:szCs w:val="24"/>
+          <w:shd w:val="pct15" w:color="auto" w:fill="FFFFFF"/>
+        </w:rPr>
+        <w:t>。</w:t>
+      </w:r>
+      <w:r>
+        <w:rPr>
+          <w:rFonts w:ascii="楷体" w:eastAsia="楷体" w:hAnsi="楷体" w:hint="eastAsia"/>
+          <w:sz w:val="24"/>
+          <w:szCs w:val="24"/>
+          <w:shd w:val="pct15" w:color="auto" w:fill="FFFFFF"/>
+        </w:rPr>
+        <w:t>白言。世尊。惟愿演说如是相类</w:t>
+      </w:r>
+      <w:r>
+        <w:rPr>
+          <w:rFonts w:ascii="楷体" w:eastAsia="楷体" w:hAnsi="楷体" w:hint="eastAsia"/>
+          <w:sz w:val="24"/>
+          <w:szCs w:val="24"/>
+          <w:shd w:val="pct15" w:color="auto" w:fill="FFFFFF"/>
+        </w:rPr>
+        <w:t>。</w:t>
+      </w:r>
+      <w:r>
+        <w:rPr>
+          <w:rFonts w:ascii="楷体" w:eastAsia="楷体" w:hAnsi="楷体" w:hint="eastAsia"/>
+          <w:sz w:val="24"/>
+          <w:szCs w:val="24"/>
+          <w:shd w:val="pct15" w:color="auto" w:fill="FFFFFF"/>
+        </w:rPr>
+        <w:t>诸佛名号及本大愿殊胜功德。令诸闻者业障销除。为欲利乐像法转时诸有情故。</w:t>
+      </w:r>
+    </w:p>
+    <w:p>
+      <w:pPr>
+        <w:rPr>
+          <w:rFonts w:ascii="楷体" w:eastAsia="楷体" w:hAnsi="楷体"/>
+          <w:sz w:val="24"/>
+          <w:szCs w:val="24"/>
+          <w:shd w:val="pct15" w:color="auto" w:fill="FFFFFF"/>
+        </w:rPr>
+      </w:pPr>
+      <w:r>
+        <w:rPr>
+          <w:rFonts w:ascii="楷体" w:eastAsia="楷体" w:hAnsi="楷体" w:hint="eastAsia"/>
+          <w:sz w:val="24"/>
+          <w:szCs w:val="24"/>
+          <w:shd w:val="pct15" w:color="auto" w:fill="FFFFFF"/>
+        </w:rPr>
+        <w:t xml:space="preserve">　　尔时世尊赞曼殊室利童子言。善哉善哉</w:t>
+      </w:r>
+      <w:r>
+        <w:rPr>
+          <w:rFonts w:ascii="楷体" w:eastAsia="楷体" w:hAnsi="楷体" w:hint="eastAsia"/>
+          <w:sz w:val="24"/>
+          <w:szCs w:val="24"/>
+          <w:shd w:val="pct15" w:color="auto" w:fill="FFFFFF"/>
+        </w:rPr>
+        <w:t>。</w:t>
+      </w:r>
+      <w:r>
+        <w:rPr>
+          <w:rFonts w:ascii="楷体" w:eastAsia="楷体" w:hAnsi="楷体" w:hint="eastAsia"/>
+          <w:sz w:val="24"/>
+          <w:szCs w:val="24"/>
+          <w:shd w:val="pct15" w:color="auto" w:fill="FFFFFF"/>
+        </w:rPr>
+        <w:t>曼殊室利。汝以大悲劝请我说诸佛名号本愿功德。为拔业障所缠有情。利益安乐像法转时诸有情故。汝今谛听极善思惟。当为汝说。</w:t>
+      </w:r>
+    </w:p>
+    <w:p>
+      <w:pPr>
+        <w:rPr>
+          <w:rFonts w:ascii="楷体" w:eastAsia="楷体" w:hAnsi="楷体"/>
+          <w:sz w:val="24"/>
+          <w:szCs w:val="24"/>
+          <w:shd w:val="pct15" w:color="auto" w:fill="FFFFFF"/>
+        </w:rPr>
+      </w:pPr>
+      <w:r>
+        <w:rPr>
+          <w:rFonts w:ascii="楷体" w:eastAsia="楷体" w:hAnsi="楷体" w:hint="eastAsia"/>
+          <w:sz w:val="24"/>
+          <w:szCs w:val="24"/>
+          <w:shd w:val="pct15" w:color="auto" w:fill="FFFFFF"/>
+        </w:rPr>
+        <w:t xml:space="preserve">　　曼殊室利言。唯然愿说。我等乐闻。</w:t>
+      </w:r>
+    </w:p>
+    <w:p>
+      <w:pPr>
+        <w:rPr>
+          <w:rFonts w:ascii="楷体" w:eastAsia="楷体" w:hAnsi="楷体"/>
+          <w:sz w:val="24"/>
+          <w:szCs w:val="24"/>
+          <w:shd w:val="pct15" w:color="auto" w:fill="FFFFFF"/>
+        </w:rPr>
+      </w:pPr>
+      <w:r>
+        <w:rPr>
+          <w:rFonts w:ascii="楷体" w:eastAsia="楷体" w:hAnsi="楷体" w:hint="eastAsia"/>
+          <w:sz w:val="24"/>
+          <w:szCs w:val="24"/>
+          <w:shd w:val="pct15" w:color="auto" w:fill="FFFFFF"/>
+        </w:rPr>
+        <w:t xml:space="preserve">　　佛告曼殊室利。东方去此过十殑伽沙等佛土。有世界名净琉璃。佛号药师琉璃光如来应正等觉</w:t>
+      </w:r>
+      <w:r>
+        <w:rPr>
+          <w:rFonts w:ascii="楷体" w:eastAsia="楷体" w:hAnsi="楷体" w:hint="eastAsia"/>
+          <w:sz w:val="24"/>
+          <w:szCs w:val="24"/>
+          <w:shd w:val="pct15" w:color="auto" w:fill="FFFFFF"/>
+        </w:rPr>
+        <w:t>。</w:t>
+      </w:r>
+      <w:r>
+        <w:rPr>
+          <w:rFonts w:ascii="楷体" w:eastAsia="楷体" w:hAnsi="楷体" w:hint="eastAsia"/>
+          <w:sz w:val="24"/>
+          <w:szCs w:val="24"/>
+          <w:shd w:val="pct15" w:color="auto" w:fill="FFFFFF"/>
+        </w:rPr>
+        <w:t>明行圆满</w:t>
+      </w:r>
+      <w:r>
+        <w:rPr>
+          <w:rFonts w:ascii="楷体" w:eastAsia="楷体" w:hAnsi="楷体" w:hint="eastAsia"/>
+          <w:sz w:val="24"/>
+          <w:szCs w:val="24"/>
+          <w:shd w:val="pct15" w:color="auto" w:fill="FFFFFF"/>
+        </w:rPr>
+        <w:t>。</w:t>
+      </w:r>
+      <w:r>
+        <w:rPr>
+          <w:rFonts w:ascii="楷体" w:eastAsia="楷体" w:hAnsi="楷体" w:hint="eastAsia"/>
+          <w:sz w:val="24"/>
+          <w:szCs w:val="24"/>
+          <w:shd w:val="pct15" w:color="auto" w:fill="FFFFFF"/>
+        </w:rPr>
+        <w:t>善逝</w:t>
+      </w:r>
+      <w:r>
+        <w:rPr>
+          <w:rFonts w:ascii="楷体" w:eastAsia="楷体" w:hAnsi="楷体" w:hint="eastAsia"/>
+          <w:sz w:val="24"/>
+          <w:szCs w:val="24"/>
+          <w:shd w:val="pct15" w:color="auto" w:fill="FFFFFF"/>
+        </w:rPr>
+        <w:t>。</w:t>
+      </w:r>
+      <w:r>
+        <w:rPr>
+          <w:rFonts w:ascii="楷体" w:eastAsia="楷体" w:hAnsi="楷体" w:hint="eastAsia"/>
+          <w:sz w:val="24"/>
+          <w:szCs w:val="24"/>
+          <w:shd w:val="pct15" w:color="auto" w:fill="FFFFFF"/>
+        </w:rPr>
+        <w:t>世间解</w:t>
+      </w:r>
+      <w:r>
+        <w:rPr>
+          <w:rFonts w:ascii="楷体" w:eastAsia="楷体" w:hAnsi="楷体" w:hint="eastAsia"/>
+          <w:sz w:val="24"/>
+          <w:szCs w:val="24"/>
+          <w:shd w:val="pct15" w:color="auto" w:fill="FFFFFF"/>
+        </w:rPr>
+        <w:t>。</w:t>
+      </w:r>
+      <w:r>
+        <w:rPr>
+          <w:rFonts w:ascii="楷体" w:eastAsia="楷体" w:hAnsi="楷体" w:hint="eastAsia"/>
+          <w:sz w:val="24"/>
+          <w:szCs w:val="24"/>
+          <w:shd w:val="pct15" w:color="auto" w:fill="FFFFFF"/>
+        </w:rPr>
+        <w:t>无上丈夫</w:t>
+      </w:r>
+      <w:r>
+        <w:rPr>
+          <w:rFonts w:ascii="楷体" w:eastAsia="楷体" w:hAnsi="楷体" w:hint="eastAsia"/>
+          <w:sz w:val="24"/>
+          <w:szCs w:val="24"/>
+          <w:shd w:val="pct15" w:color="auto" w:fill="FFFFFF"/>
+        </w:rPr>
+        <w:t>。</w:t>
+      </w:r>
+      <w:r>
+        <w:rPr>
+          <w:rFonts w:ascii="楷体" w:eastAsia="楷体" w:hAnsi="楷体" w:hint="eastAsia"/>
+          <w:sz w:val="24"/>
+          <w:szCs w:val="24"/>
+          <w:shd w:val="pct15" w:color="auto" w:fill="FFFFFF"/>
+        </w:rPr>
+        <w:t>调御士</w:t>
+      </w:r>
+      <w:r>
+        <w:rPr>
+          <w:rFonts w:ascii="楷体" w:eastAsia="楷体" w:hAnsi="楷体" w:hint="eastAsia"/>
+          <w:sz w:val="24"/>
+          <w:szCs w:val="24"/>
+          <w:shd w:val="pct15" w:color="auto" w:fill="FFFFFF"/>
+        </w:rPr>
+        <w:t>。</w:t>
+      </w:r>
+      <w:r>
+        <w:rPr>
+          <w:rFonts w:ascii="楷体" w:eastAsia="楷体" w:hAnsi="楷体" w:hint="eastAsia"/>
+          <w:sz w:val="24"/>
+          <w:szCs w:val="24"/>
+          <w:shd w:val="pct15" w:color="auto" w:fill="FFFFFF"/>
+        </w:rPr>
+        <w:t>天人师</w:t>
+      </w:r>
+      <w:r>
+        <w:rPr>
+          <w:rFonts w:ascii="楷体" w:eastAsia="楷体" w:hAnsi="楷体" w:hint="eastAsia"/>
+          <w:sz w:val="24"/>
+          <w:szCs w:val="24"/>
+          <w:shd w:val="pct15" w:color="auto" w:fill="FFFFFF"/>
+        </w:rPr>
+        <w:t>。</w:t>
+      </w:r>
+      <w:r>
+        <w:rPr>
+          <w:rFonts w:ascii="楷体" w:eastAsia="楷体" w:hAnsi="楷体" w:hint="eastAsia"/>
+          <w:sz w:val="24"/>
+          <w:szCs w:val="24"/>
+          <w:shd w:val="pct15" w:color="auto" w:fill="FFFFFF"/>
+        </w:rPr>
+        <w:t>佛薄伽梵。</w:t>
+      </w:r>
+    </w:p>
+    <w:p>
+      <w:pPr>
+        <w:rPr>
+          <w:rFonts w:ascii="楷体" w:eastAsia="楷体" w:hAnsi="楷体"/>
+          <w:sz w:val="24"/>
+          <w:szCs w:val="24"/>
+          <w:shd w:val="pct15" w:color="auto" w:fill="FFFFFF"/>
+        </w:rPr>
+      </w:pPr>
+      <w:r>
+        <w:rPr>
+          <w:rFonts w:ascii="楷体" w:eastAsia="楷体" w:hAnsi="楷体" w:hint="eastAsia"/>
+          <w:sz w:val="24"/>
+          <w:szCs w:val="24"/>
+          <w:shd w:val="pct15" w:color="auto" w:fill="FFFFFF"/>
+        </w:rPr>
+        <w:t xml:space="preserve">　　曼殊室利。彼佛世尊药师琉璃光如来</w:t>
+      </w:r>
+      <w:r>
+        <w:rPr>
+          <w:rFonts w:ascii="楷体" w:eastAsia="楷体" w:hAnsi="楷体" w:hint="eastAsia"/>
+          <w:sz w:val="24"/>
+          <w:szCs w:val="24"/>
+          <w:shd w:val="pct15" w:color="auto" w:fill="FFFFFF"/>
+        </w:rPr>
+        <w:t>本行菩萨道时发十二大愿。令诸有情所求皆得。</w:t>
+      </w:r>
+    </w:p>
+    <w:p>
+      <w:pPr>
+        <w:rPr>
+          <w:rFonts w:ascii="楷体" w:eastAsia="楷体" w:hAnsi="楷体"/>
+          <w:sz w:val="24"/>
+          <w:szCs w:val="24"/>
+          <w:shd w:val="pct15" w:color="auto" w:fill="FFFFFF"/>
+        </w:rPr>
+      </w:pPr>
+      <w:r>
+        <w:rPr>
+          <w:rFonts w:ascii="楷体" w:eastAsia="楷体" w:hAnsi="楷体" w:hint="eastAsia"/>
+          <w:sz w:val="24"/>
+          <w:szCs w:val="24"/>
+          <w:shd w:val="pct15" w:color="auto" w:fill="FFFFFF"/>
+        </w:rPr>
+        <w:t xml:space="preserve">　　第一大愿。愿我来世得阿耨多罗三藐三菩提时。自身光明炽然。照曜无量无数无边世界。以三十二大丈夫相、八十随好庄严其身。令一切有情如我无异。</w:t>
+      </w:r>
+    </w:p>
+    <w:p>
+      <w:pPr>
+        <w:rPr>
+          <w:rFonts w:ascii="楷体" w:eastAsia="楷体" w:hAnsi="楷体"/>
+          <w:sz w:val="24"/>
+          <w:szCs w:val="24"/>
+          <w:shd w:val="pct15" w:color="auto" w:fill="FFFFFF"/>
+        </w:rPr>
+      </w:pPr>
+      <w:r>
+        <w:rPr>
+          <w:rFonts w:ascii="楷体" w:eastAsia="楷体" w:hAnsi="楷体" w:hint="eastAsia"/>
+          <w:sz w:val="24"/>
+          <w:szCs w:val="24"/>
+          <w:shd w:val="pct15" w:color="auto" w:fill="FFFFFF"/>
+        </w:rPr>
+        <w:t xml:space="preserve">　　第二大愿。愿我来世得菩提时。身如琉璃内外明彻净无瑕秽。光明广大</w:t>
+      </w:r>
+      <w:r>
+        <w:rPr>
+          <w:rFonts w:ascii="楷体" w:eastAsia="楷体" w:hAnsi="楷体" w:hint="eastAsia"/>
+          <w:sz w:val="24"/>
+          <w:szCs w:val="24"/>
+          <w:shd w:val="pct15" w:color="auto" w:fill="FFFFFF"/>
+        </w:rPr>
+        <w:t>。</w:t>
+      </w:r>
+      <w:r>
+        <w:rPr>
+          <w:rFonts w:ascii="楷体" w:eastAsia="楷体" w:hAnsi="楷体" w:hint="eastAsia"/>
+          <w:sz w:val="24"/>
+          <w:szCs w:val="24"/>
+          <w:shd w:val="pct15" w:color="auto" w:fill="FFFFFF"/>
+        </w:rPr>
+        <w:t>功德巍巍。身善安住</w:t>
+      </w:r>
+      <w:r>
+        <w:rPr>
+          <w:rFonts w:ascii="楷体" w:eastAsia="楷体" w:hAnsi="楷体" w:hint="eastAsia"/>
+          <w:sz w:val="24"/>
+          <w:szCs w:val="24"/>
+          <w:shd w:val="pct15" w:color="auto" w:fill="FFFFFF"/>
+        </w:rPr>
+        <w:t>。</w:t>
+      </w:r>
+      <w:r>
+        <w:rPr>
+          <w:rFonts w:ascii="楷体" w:eastAsia="楷体" w:hAnsi="楷体" w:hint="eastAsia"/>
+          <w:sz w:val="24"/>
+          <w:szCs w:val="24"/>
+          <w:shd w:val="pct15" w:color="auto" w:fill="FFFFFF"/>
+        </w:rPr>
+        <w:t>焰网庄严过于日月。幽冥众生悉蒙开晓。随意所趣作诸事业。</w:t>
+      </w:r>
+    </w:p>
+    <w:p>
+      <w:pPr>
+        <w:rPr>
+          <w:rFonts w:ascii="楷体" w:eastAsia="楷体" w:hAnsi="楷体"/>
+          <w:sz w:val="24"/>
+          <w:szCs w:val="24"/>
+          <w:shd w:val="pct15" w:color="auto" w:fill="FFFFFF"/>
+        </w:rPr>
+      </w:pPr>
+      <w:r>
+        <w:rPr>
+          <w:rFonts w:ascii="楷体" w:eastAsia="楷体" w:hAnsi="楷体" w:hint="eastAsia"/>
+          <w:sz w:val="24"/>
+          <w:szCs w:val="24"/>
+          <w:shd w:val="pct15" w:color="auto" w:fill="FFFFFF"/>
+        </w:rPr>
+        <w:t xml:space="preserve">　　第三大愿。愿我来世得菩提时。以无量无边智慧方便。令诸有情皆得无尽所受用物。莫令众生有所乏少。</w:t>
+      </w:r>
+    </w:p>
+    <w:p>
+      <w:pPr>
+        <w:rPr>
+          <w:rFonts w:ascii="楷体" w:eastAsia="楷体" w:hAnsi="楷体"/>
+          <w:sz w:val="24"/>
+          <w:szCs w:val="24"/>
+          <w:shd w:val="pct15" w:color="auto" w:fill="FFFFFF"/>
+        </w:rPr>
+      </w:pPr>
+      <w:r>
+        <w:rPr>
+          <w:rFonts w:ascii="楷体" w:eastAsia="楷体" w:hAnsi="楷体" w:hint="eastAsia"/>
+          <w:sz w:val="24"/>
+          <w:szCs w:val="24"/>
+          <w:shd w:val="pct15" w:color="auto" w:fill="FFFFFF"/>
+        </w:rPr>
+        <w:t xml:space="preserve">　　第四大愿。</w:t>
+      </w:r>
+      <w:r>
+        <w:rPr>
+          <w:rFonts w:ascii="楷体" w:eastAsia="楷体" w:hAnsi="楷体" w:hint="eastAsia"/>
+          <w:sz w:val="24"/>
+          <w:szCs w:val="24"/>
+          <w:shd w:val="pct15" w:color="auto" w:fill="FFFFFF"/>
+        </w:rPr>
+        <w:t>愿我来世得菩提时。若诸有情行邪道者。悉令安住菩提道中。若行声闻</w:t>
+      </w:r>
+      <w:r>
+        <w:rPr>
+          <w:rFonts w:ascii="楷体" w:eastAsia="楷体" w:hAnsi="楷体" w:hint="eastAsia"/>
+          <w:sz w:val="24"/>
+          <w:szCs w:val="24"/>
+          <w:shd w:val="pct15" w:color="auto" w:fill="FFFFFF"/>
+        </w:rPr>
+        <w:t>独觉乘者。皆以大乘而安立之。</w:t>
+      </w:r>
+    </w:p>
+    <w:p>
+      <w:pPr>
+        <w:rPr>
+          <w:rFonts w:ascii="楷体" w:eastAsia="楷体" w:hAnsi="楷体"/>
+          <w:sz w:val="24"/>
+          <w:szCs w:val="24"/>
+          <w:shd w:val="pct15" w:color="auto" w:fill="FFFFFF"/>
+        </w:rPr>
+      </w:pPr>
+      <w:r>
+        <w:rPr>
+          <w:rFonts w:ascii="楷体" w:eastAsia="楷体" w:hAnsi="楷体" w:hint="eastAsia"/>
+          <w:sz w:val="24"/>
+          <w:szCs w:val="24"/>
+          <w:shd w:val="pct15" w:color="auto" w:fill="FFFFFF"/>
+        </w:rPr>
+        <w:t xml:space="preserve">　　第五大愿。愿我来世得</w:t>
+      </w:r>
+      <w:r>
+        <w:rPr>
+          <w:rFonts w:ascii="楷体" w:eastAsia="楷体" w:hAnsi="楷体" w:hint="eastAsia"/>
+          <w:sz w:val="24"/>
+          <w:szCs w:val="24"/>
+          <w:shd w:val="pct15" w:color="auto" w:fill="FFFFFF"/>
+        </w:rPr>
+        <w:t>菩提时。若有无量无边有情</w:t>
+      </w:r>
+      <w:r>
+        <w:rPr>
+          <w:rFonts w:ascii="楷体" w:eastAsia="楷体" w:hAnsi="楷体" w:hint="eastAsia"/>
+          <w:sz w:val="24"/>
+          <w:szCs w:val="24"/>
+          <w:shd w:val="pct15" w:color="auto" w:fill="FFFFFF"/>
+        </w:rPr>
+        <w:t>于我法中修行梵行。一切皆令得不缺戒。具三聚戒。设有毁犯</w:t>
+      </w:r>
+      <w:r>
+        <w:rPr>
+          <w:rFonts w:ascii="楷体" w:eastAsia="楷体" w:hAnsi="楷体" w:hint="eastAsia"/>
+          <w:sz w:val="24"/>
+          <w:szCs w:val="24"/>
+          <w:shd w:val="pct15" w:color="auto" w:fill="FFFFFF"/>
+        </w:rPr>
+        <w:t>。</w:t>
+      </w:r>
+      <w:r>
+        <w:rPr>
+          <w:rFonts w:ascii="楷体" w:eastAsia="楷体" w:hAnsi="楷体" w:hint="eastAsia"/>
+          <w:sz w:val="24"/>
+          <w:szCs w:val="24"/>
+          <w:shd w:val="pct15" w:color="auto" w:fill="FFFFFF"/>
+        </w:rPr>
+        <w:t>闻我名已</w:t>
+      </w:r>
+      <w:r>
+        <w:rPr>
+          <w:rFonts w:ascii="楷体" w:eastAsia="楷体" w:hAnsi="楷体" w:hint="eastAsia"/>
+          <w:sz w:val="24"/>
+          <w:szCs w:val="24"/>
+          <w:shd w:val="pct15" w:color="auto" w:fill="FFFFFF"/>
+        </w:rPr>
+        <w:t>。</w:t>
+      </w:r>
+      <w:r>
+        <w:rPr>
+          <w:rFonts w:ascii="楷体" w:eastAsia="楷体" w:hAnsi="楷体" w:hint="eastAsia"/>
+          <w:sz w:val="24"/>
+          <w:szCs w:val="24"/>
+          <w:shd w:val="pct15" w:color="auto" w:fill="FFFFFF"/>
+        </w:rPr>
+        <w:t>还得清净不堕恶趣。</w:t>
+      </w:r>
+    </w:p>
+    <w:p>
+      <w:pPr>
+        <w:rPr>
+          <w:rFonts w:ascii="楷体" w:eastAsia="楷体" w:hAnsi="楷体"/>
+          <w:sz w:val="24"/>
+          <w:szCs w:val="24"/>
+          <w:shd w:val="pct15" w:color="auto" w:fill="FFFFFF"/>
+        </w:rPr>
+      </w:pPr>
+      <w:r>
+        <w:rPr>
+          <w:rFonts w:ascii="楷体" w:eastAsia="楷体" w:hAnsi="楷体" w:hint="eastAsia"/>
+          <w:sz w:val="24"/>
+          <w:szCs w:val="24"/>
+          <w:shd w:val="pct15" w:color="auto" w:fill="FFFFFF"/>
+        </w:rPr>
+        <w:t xml:space="preserve">　　第六大愿。愿我来世得菩提时。若诸有情其身下劣诸根不具。丑陋顽愚盲聋喑哑。挛躄背偻白癞癫狂。种种病苦。闻我名已</w:t>
+      </w:r>
+      <w:r>
+        <w:rPr>
+          <w:rFonts w:ascii="楷体" w:eastAsia="楷体" w:hAnsi="楷体" w:hint="eastAsia"/>
+          <w:sz w:val="24"/>
+          <w:szCs w:val="24"/>
+          <w:shd w:val="pct15" w:color="auto" w:fill="FFFFFF"/>
+        </w:rPr>
+        <w:t>。</w:t>
+      </w:r>
+      <w:r>
+        <w:rPr>
+          <w:rFonts w:ascii="楷体" w:eastAsia="楷体" w:hAnsi="楷体" w:hint="eastAsia"/>
+          <w:sz w:val="24"/>
+          <w:szCs w:val="24"/>
+          <w:shd w:val="pct15" w:color="auto" w:fill="FFFFFF"/>
+        </w:rPr>
+        <w:t>一切皆得端正黠慧。诸根完具无诸疾苦。</w:t>
+      </w:r>
+    </w:p>
+    <w:p>
+      <w:pPr>
+        <w:rPr>
+          <w:rFonts w:ascii="楷体" w:eastAsia="楷体" w:hAnsi="楷体"/>
+          <w:sz w:val="24"/>
+          <w:szCs w:val="24"/>
+          <w:shd w:val="pct15" w:color="auto" w:fill="FFFFFF"/>
+        </w:rPr>
+      </w:pPr>
+      <w:r>
+        <w:rPr>
+          <w:rFonts w:ascii="楷体" w:eastAsia="楷体" w:hAnsi="楷体" w:hint="eastAsia"/>
+          <w:sz w:val="24"/>
+          <w:szCs w:val="24"/>
+          <w:shd w:val="pct15" w:color="auto" w:fill="FFFFFF"/>
+        </w:rPr>
+        <w:t xml:space="preserve">　　第七大愿。愿我来世得菩提时。若诸有情众病逼切</w:t>
+      </w:r>
+      <w:r>
+        <w:rPr>
+          <w:rFonts w:ascii="楷体" w:eastAsia="楷体" w:hAnsi="楷体" w:hint="eastAsia"/>
+          <w:sz w:val="24"/>
+          <w:szCs w:val="24"/>
+          <w:shd w:val="pct15" w:color="auto" w:fill="FFFFFF"/>
+        </w:rPr>
+        <w:t>。无救无归</w:t>
+      </w:r>
+      <w:r>
+        <w:rPr>
+          <w:rFonts w:ascii="楷体" w:eastAsia="楷体" w:hAnsi="楷体" w:hint="eastAsia"/>
+          <w:sz w:val="24"/>
+          <w:szCs w:val="24"/>
+          <w:shd w:val="pct15" w:color="auto" w:fill="FFFFFF"/>
+        </w:rPr>
+        <w:t>无医无药</w:t>
+      </w:r>
+      <w:r>
+        <w:rPr>
+          <w:rFonts w:ascii="楷体" w:eastAsia="楷体" w:hAnsi="楷体" w:hint="eastAsia"/>
+          <w:sz w:val="24"/>
+          <w:szCs w:val="24"/>
+          <w:shd w:val="pct15" w:color="auto" w:fill="FFFFFF"/>
+        </w:rPr>
+        <w:t>。</w:t>
+      </w:r>
+      <w:r>
+        <w:rPr>
+          <w:rFonts w:ascii="楷体" w:eastAsia="楷体" w:hAnsi="楷体" w:hint="eastAsia"/>
+          <w:sz w:val="24"/>
+          <w:szCs w:val="24"/>
+          <w:shd w:val="pct15" w:color="auto" w:fill="FFFFFF"/>
+        </w:rPr>
+        <w:t>无亲无家贫穷多苦。我之名号一经其耳。众病悉</w:t>
+      </w:r>
+      <w:r>
+        <w:rPr>
+          <w:rFonts w:ascii="楷体" w:eastAsia="楷体" w:hAnsi="楷体" w:hint="eastAsia"/>
+          <w:sz w:val="24"/>
+          <w:szCs w:val="24"/>
+          <w:shd w:val="pct15" w:color="auto" w:fill="FFFFFF"/>
+        </w:rPr>
+        <w:t>除</w:t>
+      </w:r>
+      <w:r>
+        <w:rPr>
+          <w:rFonts w:ascii="楷体" w:eastAsia="楷体" w:hAnsi="楷体" w:hint="eastAsia"/>
+          <w:sz w:val="24"/>
+          <w:szCs w:val="24"/>
+          <w:shd w:val="pct15" w:color="auto" w:fill="FFFFFF"/>
+        </w:rPr>
+        <w:t>身心安乐。家属资具悉皆丰足。乃至证得无上菩提。</w:t>
+      </w:r>
+    </w:p>
+    <w:p>
+      <w:pPr>
+        <w:rPr>
+          <w:rFonts w:ascii="楷体" w:eastAsia="楷体" w:hAnsi="楷体"/>
+          <w:sz w:val="24"/>
+          <w:szCs w:val="24"/>
+          <w:shd w:val="pct15" w:color="auto" w:fill="FFFFFF"/>
+        </w:rPr>
+      </w:pPr>
+      <w:r>
+        <w:rPr>
+          <w:rFonts w:ascii="楷体" w:eastAsia="楷体" w:hAnsi="楷体" w:hint="eastAsia"/>
+          <w:sz w:val="24"/>
+          <w:szCs w:val="24"/>
+          <w:shd w:val="pct15" w:color="auto" w:fill="FFFFFF"/>
+        </w:rPr>
+        <w:t xml:space="preserve">　　第八大愿。愿我来世得菩提时。若有女人为女百恶之所逼恼。极生厌离愿舍女身。闻我名已</w:t>
+      </w:r>
+      <w:r>
+        <w:rPr>
+          <w:rFonts w:ascii="楷体" w:eastAsia="楷体" w:hAnsi="楷体" w:hint="eastAsia"/>
+          <w:sz w:val="24"/>
+          <w:szCs w:val="24"/>
+          <w:shd w:val="pct15" w:color="auto" w:fill="FFFFFF"/>
+        </w:rPr>
+        <w:t>。</w:t>
+      </w:r>
+      <w:r>
+        <w:rPr>
+          <w:rFonts w:ascii="楷体" w:eastAsia="楷体" w:hAnsi="楷体" w:hint="eastAsia"/>
+          <w:sz w:val="24"/>
+          <w:szCs w:val="24"/>
+          <w:shd w:val="pct15" w:color="auto" w:fill="FFFFFF"/>
+        </w:rPr>
+        <w:t>一切皆得转女成男具丈夫相。乃至证得无上菩提。</w:t>
+      </w:r>
+    </w:p>
+    <w:p>
+      <w:pPr>
+        <w:rPr>
+          <w:rFonts w:ascii="楷体" w:eastAsia="楷体" w:hAnsi="楷体"/>
+          <w:sz w:val="24"/>
+          <w:szCs w:val="24"/>
+          <w:shd w:val="pct15" w:color="auto" w:fill="FFFFFF"/>
+        </w:rPr>
+      </w:pPr>
+      <w:r>
+        <w:rPr>
+          <w:rFonts w:ascii="楷体" w:eastAsia="楷体" w:hAnsi="楷体" w:hint="eastAsia"/>
+          <w:sz w:val="24"/>
+          <w:szCs w:val="24"/>
+          <w:shd w:val="pct15" w:color="auto" w:fill="FFFFFF"/>
+        </w:rPr>
+        <w:t xml:space="preserve">　　第九大愿。愿我来世得菩提时。令诸有情出魔罥网。解脱一切外道缠缚。若堕种种恶见稠林。皆当引摄置于正见。渐令修习诸菩萨行。速证无上正等菩提。</w:t>
+      </w:r>
+    </w:p>
+    <w:p>
+      <w:pPr>
+        <w:rPr>
+          <w:rFonts w:ascii="楷体" w:eastAsia="楷体" w:hAnsi="楷体"/>
+          <w:sz w:val="24"/>
+          <w:szCs w:val="24"/>
+          <w:shd w:val="pct15" w:color="auto" w:fill="FFFFFF"/>
+        </w:rPr>
+      </w:pPr>
+      <w:r>
+        <w:rPr>
+          <w:rFonts w:ascii="楷体" w:eastAsia="楷体" w:hAnsi="楷体" w:hint="eastAsia"/>
+          <w:sz w:val="24"/>
+          <w:szCs w:val="24"/>
+          <w:shd w:val="pct15" w:color="auto" w:fill="FFFFFF"/>
+        </w:rPr>
+        <w:t xml:space="preserve">　　第十大愿。愿我来世得菩提时。若诸有情王法所录</w:t>
+      </w:r>
+      <w:r>
+        <w:rPr>
+          <w:rFonts w:ascii="楷体" w:eastAsia="楷体" w:hAnsi="楷体" w:hint="eastAsia"/>
+          <w:sz w:val="24"/>
+          <w:szCs w:val="24"/>
+          <w:shd w:val="pct15" w:color="auto" w:fill="FFFFFF"/>
+        </w:rPr>
+        <w:t>缧缚鞭挞</w:t>
+      </w:r>
+      <w:r>
+        <w:rPr>
+          <w:rFonts w:ascii="楷体" w:eastAsia="楷体" w:hAnsi="楷体" w:hint="eastAsia"/>
+          <w:sz w:val="24"/>
+          <w:szCs w:val="24"/>
+          <w:shd w:val="pct15" w:color="auto" w:fill="FFFFFF"/>
+        </w:rPr>
+        <w:t>。</w:t>
+      </w:r>
+      <w:r>
+        <w:rPr>
+          <w:rFonts w:ascii="楷体" w:eastAsia="楷体" w:hAnsi="楷体" w:hint="eastAsia"/>
+          <w:sz w:val="24"/>
+          <w:szCs w:val="24"/>
+          <w:shd w:val="pct15" w:color="auto" w:fill="FFFFFF"/>
+        </w:rPr>
+        <w:t>系闭牢狱或当刑戮。及余无量灾难凌辱。悲愁煎迫身心受苦。若闻我名。以我福德威神力故。皆得解脱一切忧苦。</w:t>
+      </w:r>
+    </w:p>
+    <w:p>
+      <w:pPr>
+        <w:rPr>
+          <w:rFonts w:ascii="楷体" w:eastAsia="楷体" w:hAnsi="楷体"/>
+          <w:sz w:val="24"/>
+          <w:szCs w:val="24"/>
+          <w:shd w:val="pct15" w:color="auto" w:fill="FFFFFF"/>
+        </w:rPr>
+      </w:pPr>
+      <w:r>
+        <w:rPr>
+          <w:rFonts w:ascii="楷体" w:eastAsia="楷体" w:hAnsi="楷体" w:hint="eastAsia"/>
+          <w:sz w:val="24"/>
+          <w:szCs w:val="24"/>
+          <w:shd w:val="pct15" w:color="auto" w:fill="FFFFFF"/>
+        </w:rPr>
+        <w:t xml:space="preserve">　　第十一大愿。愿我来世得菩提时。若诸有情饥渴所恼。为求食故造诸恶业。得闻我名专念受持。我当先以上妙饮食饱足其身。后以法味毕竟安乐而建立之。</w:t>
+      </w:r>
+    </w:p>
+    <w:p>
+      <w:pPr>
+        <w:rPr>
+          <w:rFonts w:ascii="楷体" w:eastAsia="楷体" w:hAnsi="楷体"/>
+          <w:sz w:val="24"/>
+          <w:szCs w:val="24"/>
+          <w:shd w:val="pct15" w:color="auto" w:fill="FFFFFF"/>
+        </w:rPr>
+      </w:pPr>
+      <w:r>
+        <w:rPr>
+          <w:rFonts w:ascii="楷体" w:eastAsia="楷体" w:hAnsi="楷体" w:hint="eastAsia"/>
+          <w:sz w:val="24"/>
+          <w:szCs w:val="24"/>
+          <w:shd w:val="pct15" w:color="auto" w:fill="FFFFFF"/>
+        </w:rPr>
+        <w:t xml:space="preserve">　　第十二大愿。愿我来世得菩提时。若诸有情贫无衣服。蚊虻寒热昼夜逼恼。若闻我名专念受持。如其所好即得种种上妙衣服。亦得一切宝庄严具。华鬘涂香</w:t>
+      </w:r>
+      <w:r>
+        <w:rPr>
+          <w:rFonts w:ascii="楷体" w:eastAsia="楷体" w:hAnsi="楷体" w:hint="eastAsia"/>
+          <w:sz w:val="24"/>
+          <w:szCs w:val="24"/>
+          <w:shd w:val="pct15" w:color="auto" w:fill="FFFFFF"/>
+        </w:rPr>
+        <w:lastRenderedPageBreak/>
+        <w:t>鼓乐众伎。随心所玩皆令满足。</w:t>
+      </w:r>
+    </w:p>
+    <w:p>
+      <w:pPr>
+        <w:rPr>
+          <w:rFonts w:ascii="楷体" w:eastAsia="楷体" w:hAnsi="楷体"/>
+          <w:sz w:val="24"/>
+          <w:szCs w:val="24"/>
+          <w:shd w:val="pct15" w:color="auto" w:fill="FFFFFF"/>
+        </w:rPr>
+      </w:pPr>
+      <w:r>
+        <w:rPr>
+          <w:rFonts w:ascii="楷体" w:eastAsia="楷体" w:hAnsi="楷体" w:hint="eastAsia"/>
+          <w:sz w:val="24"/>
+          <w:szCs w:val="24"/>
+          <w:shd w:val="pct15" w:color="auto" w:fill="FFFFFF"/>
+        </w:rPr>
+        <w:t xml:space="preserve">　　曼殊室利。是为彼世尊药师琉璃光如来应</w:t>
+      </w:r>
+      <w:r>
+        <w:rPr>
+          <w:rFonts w:ascii="楷体" w:eastAsia="楷体" w:hAnsi="楷体" w:hint="eastAsia"/>
+          <w:sz w:val="24"/>
+          <w:szCs w:val="24"/>
+          <w:shd w:val="pct15" w:color="auto" w:fill="FFFFFF"/>
+        </w:rPr>
+        <w:t>正等觉</w:t>
+      </w:r>
+      <w:r>
+        <w:rPr>
+          <w:rFonts w:ascii="楷体" w:eastAsia="楷体" w:hAnsi="楷体" w:hint="eastAsia"/>
+          <w:sz w:val="24"/>
+          <w:szCs w:val="24"/>
+          <w:shd w:val="pct15" w:color="auto" w:fill="FFFFFF"/>
+        </w:rPr>
+        <w:t>行菩萨道时所发十二微妙上愿。</w:t>
+      </w:r>
+    </w:p>
+    <w:p>
+      <w:pPr>
+        <w:rPr>
+          <w:rFonts w:ascii="楷体" w:eastAsia="楷体" w:hAnsi="楷体"/>
+          <w:sz w:val="24"/>
+          <w:szCs w:val="24"/>
+          <w:shd w:val="pct15" w:color="auto" w:fill="FFFFFF"/>
+        </w:rPr>
+      </w:pPr>
+      <w:r>
+        <w:rPr>
+          <w:rFonts w:ascii="楷体" w:eastAsia="楷体" w:hAnsi="楷体" w:hint="eastAsia"/>
+          <w:sz w:val="24"/>
+          <w:szCs w:val="24"/>
+          <w:shd w:val="pct15" w:color="auto" w:fill="FFFFFF"/>
+        </w:rPr>
+        <w:t xml:space="preserve">　　复次曼殊室利。彼世</w:t>
+      </w:r>
+      <w:r>
+        <w:rPr>
+          <w:rFonts w:ascii="楷体" w:eastAsia="楷体" w:hAnsi="楷体" w:hint="eastAsia"/>
+          <w:sz w:val="24"/>
+          <w:szCs w:val="24"/>
+          <w:shd w:val="pct15" w:color="auto" w:fill="FFFFFF"/>
+        </w:rPr>
+        <w:t>尊药师琉璃光如来行菩萨道时</w:t>
+      </w:r>
+      <w:r>
+        <w:rPr>
+          <w:rFonts w:ascii="楷体" w:eastAsia="楷体" w:hAnsi="楷体" w:hint="eastAsia"/>
+          <w:sz w:val="24"/>
+          <w:szCs w:val="24"/>
+          <w:shd w:val="pct15" w:color="auto" w:fill="FFFFFF"/>
+        </w:rPr>
+        <w:t>所发大愿</w:t>
+      </w:r>
+      <w:r>
+        <w:rPr>
+          <w:rFonts w:ascii="楷体" w:eastAsia="楷体" w:hAnsi="楷体" w:hint="eastAsia"/>
+          <w:sz w:val="24"/>
+          <w:szCs w:val="24"/>
+          <w:shd w:val="pct15" w:color="auto" w:fill="FFFFFF"/>
+        </w:rPr>
+        <w:t>。</w:t>
+      </w:r>
+      <w:r>
+        <w:rPr>
+          <w:rFonts w:ascii="楷体" w:eastAsia="楷体" w:hAnsi="楷体" w:hint="eastAsia"/>
+          <w:sz w:val="24"/>
+          <w:szCs w:val="24"/>
+          <w:shd w:val="pct15" w:color="auto" w:fill="FFFFFF"/>
+        </w:rPr>
+        <w:t>及彼佛土功德庄严。我若一劫</w:t>
+      </w:r>
+      <w:r>
+        <w:rPr>
+          <w:rFonts w:ascii="楷体" w:eastAsia="楷体" w:hAnsi="楷体" w:hint="eastAsia"/>
+          <w:sz w:val="24"/>
+          <w:szCs w:val="24"/>
+          <w:shd w:val="pct15" w:color="auto" w:fill="FFFFFF"/>
+        </w:rPr>
+        <w:t>若一劫余说不能尽。然彼佛土一向清净无有女人。亦无恶趣及苦音声。琉璃为地金绳界道。城阙宫阁轩窗罗网皆七宝成。亦如西方极乐世界。功德庄严等无差别。于其国中有二菩萨摩诃萨。一名日光遍照。二名月光遍照。是彼无量无数菩萨众之上首。悉能持彼世尊药师琉璃光如来正法宝藏。是故曼殊室利。诸有信心善男子善女人等。应当愿生彼佛世界。</w:t>
+      </w:r>
+    </w:p>
+    <w:p>
+      <w:pPr>
+        <w:rPr>
+          <w:rFonts w:ascii="楷体" w:eastAsia="楷体" w:hAnsi="楷体"/>
+          <w:sz w:val="24"/>
+          <w:szCs w:val="24"/>
+          <w:shd w:val="pct15" w:color="auto" w:fill="FFFFFF"/>
+        </w:rPr>
+      </w:pPr>
+      <w:r>
+        <w:rPr>
+          <w:rFonts w:ascii="楷体" w:eastAsia="楷体" w:hAnsi="楷体" w:hint="eastAsia"/>
+          <w:sz w:val="24"/>
+          <w:szCs w:val="24"/>
+          <w:shd w:val="pct15" w:color="auto" w:fill="FFFFFF"/>
+        </w:rPr>
+        <w:t xml:space="preserve">　　尔时世尊复告曼殊师利童子言。曼殊室利。有诸众生不识善恶。唯怀贪吝不知布施及施果报。愚痴无智阙于信根。多聚财宝勤加守护。见乞者来其心不喜。设不获已而行施时。如割身肉深生痛惜。复有无量悭贪有情积集资财。于其自身尚不受用。何况能与父母妻子奴婢作使及来乞者。彼诸有情从</w:t>
+      </w:r>
+      <w:r>
+        <w:rPr>
+          <w:rFonts w:ascii="楷体" w:eastAsia="楷体" w:hAnsi="楷体" w:hint="eastAsia"/>
+          <w:sz w:val="24"/>
+          <w:szCs w:val="24"/>
+          <w:shd w:val="pct15" w:color="auto" w:fill="FFFFFF"/>
+        </w:rPr>
+        <w:t>此命终。生饿鬼界或傍生趣。由昔人间曾得暂闻药师琉璃光如来名故。今在恶趣</w:t>
+      </w:r>
+      <w:r>
+        <w:rPr>
+          <w:rFonts w:ascii="楷体" w:eastAsia="楷体" w:hAnsi="楷体" w:hint="eastAsia"/>
+          <w:sz w:val="24"/>
+          <w:szCs w:val="24"/>
+          <w:shd w:val="pct15" w:color="auto" w:fill="FFFFFF"/>
+        </w:rPr>
+        <w:t>暂得忆念彼如来名。即于念时从彼处没还生人中。得宿命念</w:t>
+      </w:r>
+      <w:r>
+        <w:rPr>
+          <w:rFonts w:ascii="楷体" w:eastAsia="楷体" w:hAnsi="楷体" w:hint="eastAsia"/>
+          <w:sz w:val="24"/>
+          <w:szCs w:val="24"/>
+          <w:shd w:val="pct15" w:color="auto" w:fill="FFFFFF"/>
+        </w:rPr>
+        <w:t>。</w:t>
+      </w:r>
+      <w:r>
+        <w:rPr>
+          <w:rFonts w:ascii="楷体" w:eastAsia="楷体" w:hAnsi="楷体" w:hint="eastAsia"/>
+          <w:sz w:val="24"/>
+          <w:szCs w:val="24"/>
+          <w:shd w:val="pct15" w:color="auto" w:fill="FFFFFF"/>
+        </w:rPr>
+        <w:t>畏恶趣苦</w:t>
+      </w:r>
+      <w:r>
+        <w:rPr>
+          <w:rFonts w:ascii="楷体" w:eastAsia="楷体" w:hAnsi="楷体" w:hint="eastAsia"/>
+          <w:sz w:val="24"/>
+          <w:szCs w:val="24"/>
+          <w:shd w:val="pct15" w:color="auto" w:fill="FFFFFF"/>
+        </w:rPr>
+        <w:t>。</w:t>
+      </w:r>
+      <w:r>
+        <w:rPr>
+          <w:rFonts w:ascii="楷体" w:eastAsia="楷体" w:hAnsi="楷体" w:hint="eastAsia"/>
+          <w:sz w:val="24"/>
+          <w:szCs w:val="24"/>
+          <w:shd w:val="pct15" w:color="auto" w:fill="FFFFFF"/>
+        </w:rPr>
+        <w:t>不乐欲乐。好行惠施赞叹施者。一切所有悉无贪惜。渐次尚能以头目手足血肉身分施来求者。况余财物。</w:t>
+      </w:r>
+    </w:p>
+    <w:p>
+      <w:pPr>
+        <w:rPr>
+          <w:rFonts w:ascii="楷体" w:eastAsia="楷体" w:hAnsi="楷体"/>
+          <w:sz w:val="24"/>
+          <w:szCs w:val="24"/>
+          <w:shd w:val="pct15" w:color="auto" w:fill="FFFFFF"/>
+        </w:rPr>
+      </w:pPr>
+      <w:r>
+        <w:rPr>
+          <w:rFonts w:ascii="楷体" w:eastAsia="楷体" w:hAnsi="楷体" w:hint="eastAsia"/>
+          <w:sz w:val="24"/>
+          <w:szCs w:val="24"/>
+          <w:shd w:val="pct15" w:color="auto" w:fill="FFFFFF"/>
+        </w:rPr>
+        <w:t xml:space="preserve">　　复次曼殊室利。若诸有情虽于如来受诸学处而破尸罗。有虽不破尸罗而破轨则。有于尸罗轨则虽得不坏然毁正见。有虽不毁正见而弃多闻</w:t>
+      </w:r>
+      <w:r>
+        <w:rPr>
+          <w:rFonts w:ascii="楷体" w:eastAsia="楷体" w:hAnsi="楷体" w:hint="eastAsia"/>
+          <w:sz w:val="24"/>
+          <w:szCs w:val="24"/>
+          <w:shd w:val="pct15" w:color="auto" w:fill="FFFFFF"/>
+        </w:rPr>
+        <w:t>。</w:t>
+      </w:r>
+      <w:r>
+        <w:rPr>
+          <w:rFonts w:ascii="楷体" w:eastAsia="楷体" w:hAnsi="楷体" w:hint="eastAsia"/>
+          <w:sz w:val="24"/>
+          <w:szCs w:val="24"/>
+          <w:shd w:val="pct15" w:color="auto" w:fill="FFFFFF"/>
+        </w:rPr>
+        <w:t>于佛所说契经深义不能解了。有虽多闻而增上慢。由增上慢覆蔽心故。自是非他</w:t>
+      </w:r>
+      <w:r>
+        <w:rPr>
+          <w:rFonts w:ascii="楷体" w:eastAsia="楷体" w:hAnsi="楷体" w:hint="eastAsia"/>
+          <w:sz w:val="24"/>
+          <w:szCs w:val="24"/>
+          <w:shd w:val="pct15" w:color="auto" w:fill="FFFFFF"/>
+        </w:rPr>
+        <w:t>。</w:t>
+      </w:r>
+      <w:r>
+        <w:rPr>
+          <w:rFonts w:ascii="楷体" w:eastAsia="楷体" w:hAnsi="楷体" w:hint="eastAsia"/>
+          <w:sz w:val="24"/>
+          <w:szCs w:val="24"/>
+          <w:shd w:val="pct15" w:color="auto" w:fill="FFFFFF"/>
+        </w:rPr>
+        <w:t>嫌谤正法为魔伴党。如是愚人自行邪见。复令无量俱胝有情堕大险坑。此诸有情应于地狱傍生鬼趣流转无穷。若得闻此药师琉璃光如来名号。便舍恶行修诸善法不堕恶趣。设有不能舍诸恶行、修行善法，堕恶趣者。以彼如来本愿威力。令其现前暂闻名号。从彼命终还生人趣。得正见精进善调意乐。便能舍家趣于非家。如来法中受持学处无有毁犯。正见多闻解甚深义。离增上慢</w:t>
+      </w:r>
+      <w:r>
+        <w:rPr>
+          <w:rFonts w:ascii="楷体" w:eastAsia="楷体" w:hAnsi="楷体" w:hint="eastAsia"/>
+          <w:sz w:val="24"/>
+          <w:szCs w:val="24"/>
+          <w:shd w:val="pct15" w:color="auto" w:fill="FFFFFF"/>
+        </w:rPr>
+        <w:t>。</w:t>
+      </w:r>
+      <w:r>
+        <w:rPr>
+          <w:rFonts w:ascii="楷体" w:eastAsia="楷体" w:hAnsi="楷体" w:hint="eastAsia"/>
+          <w:sz w:val="24"/>
+          <w:szCs w:val="24"/>
+          <w:shd w:val="pct15" w:color="auto" w:fill="FFFFFF"/>
+        </w:rPr>
+        <w:t>不谤正法不为魔伴。渐次修行诸菩萨行速得圆满。</w:t>
+      </w:r>
+    </w:p>
+    <w:p>
+      <w:pPr>
+        <w:rPr>
+          <w:rFonts w:ascii="楷体" w:eastAsia="楷体" w:hAnsi="楷体"/>
+          <w:sz w:val="24"/>
+          <w:szCs w:val="24"/>
+          <w:shd w:val="pct15" w:color="auto" w:fill="FFFFFF"/>
+        </w:rPr>
+      </w:pPr>
+      <w:r>
+        <w:rPr>
+          <w:rFonts w:ascii="楷体" w:eastAsia="楷体" w:hAnsi="楷体" w:hint="eastAsia"/>
+          <w:sz w:val="24"/>
+          <w:szCs w:val="24"/>
+          <w:shd w:val="pct15" w:color="auto" w:fill="FFFFFF"/>
+        </w:rPr>
+        <w:t xml:space="preserve">　　复次曼殊室利。若诸有情悭贪嫉妒自赞毁他。当堕三恶趣中无量千岁受诸剧苦。受剧苦已。从彼命终来生人间作牛马驼驴。恒被鞭挞饥渴逼恼。又常负重随路而行。或得为人生居下贱。作人奴婢受他驱役恒不自在。若昔人中曾闻世尊药师琉璃光如来名号。由此善因今复忆念至心归依。以佛神力众苦解脱。诸根聪利智慧多闻。恒求胜法常遇善友。永断魔罥破无明</w:t>
+      </w:r>
+      <w:r>
+        <w:rPr>
+          <w:rFonts w:ascii="楷体" w:eastAsia="楷体" w:hAnsi="楷体" w:hint="eastAsia"/>
+          <w:sz w:val="24"/>
+          <w:szCs w:val="24"/>
+          <w:shd w:val="pct15" w:color="auto" w:fill="FFFFFF"/>
+        </w:rPr>
+        <w:t>壳</w:t>
+      </w:r>
       <w:bookmarkStart w:id="0" w:name="_GoBack"/>
       <w:bookmarkEnd w:id="0"/>
       <w:r>
         <w:rPr>
-          <w:rFonts w:ascii="楷体" w:eastAsia="楷体" w:hAnsi="楷体" w:hint="eastAsia"/>
-          <w:sz w:val="24"/>
-          <w:szCs w:val="24"/>
-          <w:shd w:val="pct15" w:color="auto" w:fill="FFFFFF"/>
-        </w:rPr>
-        <w:t>大唐三藏法师玄奘奉</w:t>
-      </w:r>
-      <w:r>
-        <w:rPr>
-          <w:rFonts w:ascii="楷体" w:eastAsia="楷体" w:hAnsi="楷体" w:hint="eastAsia"/>
-          <w:sz w:val="24"/>
-          <w:szCs w:val="24"/>
-          <w:shd w:val="pct15" w:color="auto" w:fill="FFFFFF"/>
-        </w:rPr>
-        <w:t xml:space="preserve"> </w:t>
-      </w:r>
-      <w:r>
-        <w:rPr>
-          <w:rFonts w:ascii="楷体" w:eastAsia="楷体" w:hAnsi="楷体" w:hint="eastAsia"/>
-          <w:sz w:val="24"/>
-          <w:szCs w:val="24"/>
-          <w:shd w:val="pct15" w:color="auto" w:fill="FFFFFF"/>
-        </w:rPr>
-        <w:t>诏译</w:t>
-      </w:r>
-    </w:p>
-    <w:p>
-      <w:pPr>
-        <w:rPr>
-          <w:rFonts w:ascii="楷体" w:eastAsia="楷体" w:hAnsi="楷体"/>
-          <w:sz w:val="24"/>
-          <w:szCs w:val="24"/>
-          <w:shd w:val="pct15" w:color="auto" w:fill="FFFFFF"/>
-        </w:rPr>
-      </w:pPr>
-      <w:r>
-        <w:rPr>
-          <w:rFonts w:ascii="楷体" w:eastAsia="楷体" w:hAnsi="楷体" w:hint="eastAsia"/>
-          <w:sz w:val="24"/>
-          <w:szCs w:val="24"/>
-          <w:shd w:val="pct15" w:color="auto" w:fill="FFFFFF"/>
-        </w:rPr>
-        <w:t xml:space="preserve">　　如是我闻。一时薄伽梵游化诸国</w:t>
-      </w:r>
-      <w:r>
-        <w:rPr>
-          <w:rFonts w:ascii="楷体" w:eastAsia="楷体" w:hAnsi="楷体" w:hint="eastAsia"/>
-          <w:sz w:val="24"/>
-          <w:szCs w:val="24"/>
-          <w:shd w:val="pct15" w:color="auto" w:fill="FFFFFF"/>
-        </w:rPr>
-        <w:t>。</w:t>
-      </w:r>
-      <w:r>
-        <w:rPr>
-          <w:rFonts w:ascii="楷体" w:eastAsia="楷体" w:hAnsi="楷体" w:hint="eastAsia"/>
-          <w:sz w:val="24"/>
-          <w:szCs w:val="24"/>
-          <w:shd w:val="pct15" w:color="auto" w:fill="FFFFFF"/>
-        </w:rPr>
-        <w:t>至广严城住乐音树下</w:t>
-      </w:r>
-      <w:r>
-        <w:rPr>
-          <w:rFonts w:ascii="楷体" w:eastAsia="楷体" w:hAnsi="楷体" w:hint="eastAsia"/>
-          <w:sz w:val="24"/>
-          <w:szCs w:val="24"/>
-          <w:shd w:val="pct15" w:color="auto" w:fill="FFFFFF"/>
-        </w:rPr>
-        <w:t>。</w:t>
-      </w:r>
-      <w:r>
-        <w:rPr>
-          <w:rFonts w:ascii="楷体" w:eastAsia="楷体" w:hAnsi="楷体" w:hint="eastAsia"/>
-          <w:sz w:val="24"/>
-          <w:szCs w:val="24"/>
-          <w:shd w:val="pct15" w:color="auto" w:fill="FFFFFF"/>
-        </w:rPr>
-        <w:t>与大苾刍众八千人俱。菩萨摩诃萨三万六千。及国王大臣婆罗门居士天龙药叉人非人等。无量大众恭敬围绕而为说法。</w:t>
-      </w:r>
-    </w:p>
-    <w:p>
-      <w:pPr>
-        <w:rPr>
-          <w:rFonts w:ascii="楷体" w:eastAsia="楷体" w:hAnsi="楷体"/>
-          <w:sz w:val="24"/>
-          <w:szCs w:val="24"/>
-          <w:shd w:val="pct15" w:color="auto" w:fill="FFFFFF"/>
-        </w:rPr>
-      </w:pPr>
-      <w:r>
-        <w:rPr>
-          <w:rFonts w:ascii="楷体" w:eastAsia="楷体" w:hAnsi="楷体" w:hint="eastAsia"/>
-          <w:sz w:val="24"/>
-          <w:szCs w:val="24"/>
-          <w:shd w:val="pct15" w:color="auto" w:fill="FFFFFF"/>
-        </w:rPr>
-        <w:t xml:space="preserve">　　尔时曼殊室利法王子承佛威神从座而起。偏袒一肩右膝著地。向薄伽梵曲躬合掌</w:t>
-      </w:r>
-      <w:r>
-        <w:rPr>
-          <w:rFonts w:ascii="楷体" w:eastAsia="楷体" w:hAnsi="楷体" w:hint="eastAsia"/>
-          <w:sz w:val="24"/>
-          <w:szCs w:val="24"/>
-          <w:shd w:val="pct15" w:color="auto" w:fill="FFFFFF"/>
-        </w:rPr>
-        <w:t>。</w:t>
-      </w:r>
-      <w:r>
-        <w:rPr>
-          <w:rFonts w:ascii="楷体" w:eastAsia="楷体" w:hAnsi="楷体" w:hint="eastAsia"/>
-          <w:sz w:val="24"/>
-          <w:szCs w:val="24"/>
-          <w:shd w:val="pct15" w:color="auto" w:fill="FFFFFF"/>
-        </w:rPr>
-        <w:t>白言。世尊。惟愿演说如是相类</w:t>
-      </w:r>
-      <w:r>
-        <w:rPr>
-          <w:rFonts w:ascii="楷体" w:eastAsia="楷体" w:hAnsi="楷体" w:hint="eastAsia"/>
-          <w:sz w:val="24"/>
-          <w:szCs w:val="24"/>
-          <w:shd w:val="pct15" w:color="auto" w:fill="FFFFFF"/>
-        </w:rPr>
-        <w:t>。</w:t>
-      </w:r>
-      <w:r>
-        <w:rPr>
-          <w:rFonts w:ascii="楷体" w:eastAsia="楷体" w:hAnsi="楷体" w:hint="eastAsia"/>
-          <w:sz w:val="24"/>
-          <w:szCs w:val="24"/>
-          <w:shd w:val="pct15" w:color="auto" w:fill="FFFFFF"/>
-        </w:rPr>
-        <w:t>诸佛名号及本大愿殊胜功德。令诸闻者业障销除。为欲利乐像法转时诸有情故。</w:t>
-      </w:r>
-    </w:p>
-    <w:p>
-      <w:pPr>
-        <w:rPr>
-          <w:rFonts w:ascii="楷体" w:eastAsia="楷体" w:hAnsi="楷体"/>
-          <w:sz w:val="24"/>
-          <w:szCs w:val="24"/>
-          <w:shd w:val="pct15" w:color="auto" w:fill="FFFFFF"/>
-        </w:rPr>
-      </w:pPr>
-      <w:r>
-        <w:rPr>
-          <w:rFonts w:ascii="楷体" w:eastAsia="楷体" w:hAnsi="楷体" w:hint="eastAsia"/>
-          <w:sz w:val="24"/>
-          <w:szCs w:val="24"/>
-          <w:shd w:val="pct15" w:color="auto" w:fill="FFFFFF"/>
-        </w:rPr>
-        <w:t xml:space="preserve">　　尔时世尊赞曼殊室利童子言。善哉善哉</w:t>
-      </w:r>
-      <w:r>
-        <w:rPr>
-          <w:rFonts w:ascii="楷体" w:eastAsia="楷体" w:hAnsi="楷体" w:hint="eastAsia"/>
-          <w:sz w:val="24"/>
-          <w:szCs w:val="24"/>
-          <w:shd w:val="pct15" w:color="auto" w:fill="FFFFFF"/>
-        </w:rPr>
-        <w:t>。</w:t>
-      </w:r>
-      <w:r>
-        <w:rPr>
-          <w:rFonts w:ascii="楷体" w:eastAsia="楷体" w:hAnsi="楷体" w:hint="eastAsia"/>
-          <w:sz w:val="24"/>
-          <w:szCs w:val="24"/>
-          <w:shd w:val="pct15" w:color="auto" w:fill="FFFFFF"/>
-        </w:rPr>
-        <w:t>曼殊室利。汝以大悲劝请我说诸佛名号本愿功德。为拔业障所缠有情。利益安乐像法转时诸有情故。汝今谛听极善思惟。当为汝说。</w:t>
-      </w:r>
-    </w:p>
-    <w:p>
-      <w:pPr>
-        <w:rPr>
-          <w:rFonts w:ascii="楷体" w:eastAsia="楷体" w:hAnsi="楷体"/>
-          <w:sz w:val="24"/>
-          <w:szCs w:val="24"/>
-          <w:shd w:val="pct15" w:color="auto" w:fill="FFFFFF"/>
-        </w:rPr>
-      </w:pPr>
-      <w:r>
-        <w:rPr>
-          <w:rFonts w:ascii="楷体" w:eastAsia="楷体" w:hAnsi="楷体" w:hint="eastAsia"/>
-          <w:sz w:val="24"/>
-          <w:szCs w:val="24"/>
-          <w:shd w:val="pct15" w:color="auto" w:fill="FFFFFF"/>
-        </w:rPr>
-        <w:t xml:space="preserve">　　曼殊室利言。唯然愿说。我等乐闻。</w:t>
-      </w:r>
-    </w:p>
-    <w:p>
-      <w:pPr>
-        <w:rPr>
-          <w:rFonts w:ascii="楷体" w:eastAsia="楷体" w:hAnsi="楷体"/>
-          <w:sz w:val="24"/>
-          <w:szCs w:val="24"/>
-          <w:shd w:val="pct15" w:color="auto" w:fill="FFFFFF"/>
-        </w:rPr>
-      </w:pPr>
-      <w:r>
-        <w:rPr>
-          <w:rFonts w:ascii="楷体" w:eastAsia="楷体" w:hAnsi="楷体" w:hint="eastAsia"/>
-          <w:sz w:val="24"/>
-          <w:szCs w:val="24"/>
-          <w:shd w:val="pct15" w:color="auto" w:fill="FFFFFF"/>
-        </w:rPr>
-        <w:t xml:space="preserve">　　佛告曼殊室利。东方去此过十殑伽沙等佛土。有世界名净琉璃。佛号药师琉璃光如来应正等觉</w:t>
-      </w:r>
-      <w:r>
-        <w:rPr>
-          <w:rFonts w:ascii="楷体" w:eastAsia="楷体" w:hAnsi="楷体" w:hint="eastAsia"/>
-          <w:sz w:val="24"/>
-          <w:szCs w:val="24"/>
-          <w:shd w:val="pct15" w:color="auto" w:fill="FFFFFF"/>
-        </w:rPr>
-        <w:t>。</w:t>
-      </w:r>
-      <w:r>
-        <w:rPr>
-          <w:rFonts w:ascii="楷体" w:eastAsia="楷体" w:hAnsi="楷体" w:hint="eastAsia"/>
-          <w:sz w:val="24"/>
-          <w:szCs w:val="24"/>
-          <w:shd w:val="pct15" w:color="auto" w:fill="FFFFFF"/>
-        </w:rPr>
-        <w:t>明行圆满</w:t>
-      </w:r>
-      <w:r>
-        <w:rPr>
-          <w:rFonts w:ascii="楷体" w:eastAsia="楷体" w:hAnsi="楷体" w:hint="eastAsia"/>
-          <w:sz w:val="24"/>
-          <w:szCs w:val="24"/>
-          <w:shd w:val="pct15" w:color="auto" w:fill="FFFFFF"/>
-        </w:rPr>
-        <w:t>。</w:t>
-      </w:r>
-      <w:r>
-        <w:rPr>
-          <w:rFonts w:ascii="楷体" w:eastAsia="楷体" w:hAnsi="楷体" w:hint="eastAsia"/>
-          <w:sz w:val="24"/>
-          <w:szCs w:val="24"/>
-          <w:shd w:val="pct15" w:color="auto" w:fill="FFFFFF"/>
-        </w:rPr>
-        <w:t>善逝</w:t>
-      </w:r>
-      <w:r>
-        <w:rPr>
-          <w:rFonts w:ascii="楷体" w:eastAsia="楷体" w:hAnsi="楷体" w:hint="eastAsia"/>
-          <w:sz w:val="24"/>
-          <w:szCs w:val="24"/>
-          <w:shd w:val="pct15" w:color="auto" w:fill="FFFFFF"/>
-        </w:rPr>
-        <w:t>。</w:t>
-      </w:r>
-      <w:r>
-        <w:rPr>
-          <w:rFonts w:ascii="楷体" w:eastAsia="楷体" w:hAnsi="楷体" w:hint="eastAsia"/>
-          <w:sz w:val="24"/>
-          <w:szCs w:val="24"/>
-          <w:shd w:val="pct15" w:color="auto" w:fill="FFFFFF"/>
-        </w:rPr>
-        <w:t>世间解</w:t>
-      </w:r>
-      <w:r>
-        <w:rPr>
-          <w:rFonts w:ascii="楷体" w:eastAsia="楷体" w:hAnsi="楷体" w:hint="eastAsia"/>
-          <w:sz w:val="24"/>
-          <w:szCs w:val="24"/>
-          <w:shd w:val="pct15" w:color="auto" w:fill="FFFFFF"/>
-        </w:rPr>
-        <w:t>。</w:t>
-      </w:r>
-      <w:r>
-        <w:rPr>
-          <w:rFonts w:ascii="楷体" w:eastAsia="楷体" w:hAnsi="楷体" w:hint="eastAsia"/>
-          <w:sz w:val="24"/>
-          <w:szCs w:val="24"/>
-          <w:shd w:val="pct15" w:color="auto" w:fill="FFFFFF"/>
-        </w:rPr>
-        <w:t>无上丈夫</w:t>
-      </w:r>
-      <w:r>
-        <w:rPr>
-          <w:rFonts w:ascii="楷体" w:eastAsia="楷体" w:hAnsi="楷体" w:hint="eastAsia"/>
-          <w:sz w:val="24"/>
-          <w:szCs w:val="24"/>
-          <w:shd w:val="pct15" w:color="auto" w:fill="FFFFFF"/>
-        </w:rPr>
-        <w:t>。</w:t>
-      </w:r>
-      <w:r>
-        <w:rPr>
-          <w:rFonts w:ascii="楷体" w:eastAsia="楷体" w:hAnsi="楷体" w:hint="eastAsia"/>
-          <w:sz w:val="24"/>
-          <w:szCs w:val="24"/>
-          <w:shd w:val="pct15" w:color="auto" w:fill="FFFFFF"/>
-        </w:rPr>
-        <w:t>调御士</w:t>
-      </w:r>
-      <w:r>
-        <w:rPr>
-          <w:rFonts w:ascii="楷体" w:eastAsia="楷体" w:hAnsi="楷体" w:hint="eastAsia"/>
-          <w:sz w:val="24"/>
-          <w:szCs w:val="24"/>
-          <w:shd w:val="pct15" w:color="auto" w:fill="FFFFFF"/>
-        </w:rPr>
-        <w:t>。</w:t>
-      </w:r>
-      <w:r>
-        <w:rPr>
-          <w:rFonts w:ascii="楷体" w:eastAsia="楷体" w:hAnsi="楷体" w:hint="eastAsia"/>
-          <w:sz w:val="24"/>
-          <w:szCs w:val="24"/>
-          <w:shd w:val="pct15" w:color="auto" w:fill="FFFFFF"/>
-        </w:rPr>
-        <w:t>天人师</w:t>
-      </w:r>
-      <w:r>
-        <w:rPr>
-          <w:rFonts w:ascii="楷体" w:eastAsia="楷体" w:hAnsi="楷体" w:hint="eastAsia"/>
-          <w:sz w:val="24"/>
-          <w:szCs w:val="24"/>
-          <w:shd w:val="pct15" w:color="auto" w:fill="FFFFFF"/>
-        </w:rPr>
-        <w:t>。</w:t>
-      </w:r>
-      <w:r>
-        <w:rPr>
-          <w:rFonts w:ascii="楷体" w:eastAsia="楷体" w:hAnsi="楷体" w:hint="eastAsia"/>
-          <w:sz w:val="24"/>
-          <w:szCs w:val="24"/>
-          <w:shd w:val="pct15" w:color="auto" w:fill="FFFFFF"/>
-        </w:rPr>
-        <w:t>佛薄伽梵。</w:t>
-      </w:r>
-    </w:p>
-    <w:p>
-      <w:pPr>
-        <w:rPr>
-          <w:rFonts w:ascii="楷体" w:eastAsia="楷体" w:hAnsi="楷体"/>
-          <w:sz w:val="24"/>
-          <w:szCs w:val="24"/>
-          <w:shd w:val="pct15" w:color="auto" w:fill="FFFFFF"/>
-        </w:rPr>
-      </w:pPr>
-      <w:r>
-        <w:rPr>
-          <w:rFonts w:ascii="楷体" w:eastAsia="楷体" w:hAnsi="楷体" w:hint="eastAsia"/>
-          <w:sz w:val="24"/>
-          <w:szCs w:val="24"/>
-          <w:shd w:val="pct15" w:color="auto" w:fill="FFFFFF"/>
-        </w:rPr>
-        <w:t xml:space="preserve">　　曼殊室利。彼佛世尊药师琉璃光如来</w:t>
-      </w:r>
-      <w:r>
-        <w:rPr>
-          <w:rFonts w:ascii="楷体" w:eastAsia="楷体" w:hAnsi="楷体" w:hint="eastAsia"/>
-          <w:sz w:val="24"/>
-          <w:szCs w:val="24"/>
-          <w:shd w:val="pct15" w:color="auto" w:fill="FFFFFF"/>
-        </w:rPr>
-        <w:t>本行菩萨道时发十二大愿。令诸有情所求皆得。</w:t>
-      </w:r>
-    </w:p>
-    <w:p>
-      <w:pPr>
-        <w:rPr>
-          <w:rFonts w:ascii="楷体" w:eastAsia="楷体" w:hAnsi="楷体"/>
-          <w:sz w:val="24"/>
-          <w:szCs w:val="24"/>
-          <w:shd w:val="pct15" w:color="auto" w:fill="FFFFFF"/>
-        </w:rPr>
-      </w:pPr>
-      <w:r>
-        <w:rPr>
-          <w:rFonts w:ascii="楷体" w:eastAsia="楷体" w:hAnsi="楷体" w:hint="eastAsia"/>
-          <w:sz w:val="24"/>
-          <w:szCs w:val="24"/>
-          <w:shd w:val="pct15" w:color="auto" w:fill="FFFFFF"/>
-        </w:rPr>
-        <w:t xml:space="preserve">　　第一大愿。愿我来世得阿耨多罗三藐三菩提时。自身光明炽然。照曜无量无数无边世界。以三十二大丈夫相、八十随好庄严其身。令一切有情如我无异。</w:t>
-      </w:r>
-    </w:p>
-    <w:p>
-      <w:pPr>
-        <w:rPr>
-          <w:rFonts w:ascii="楷体" w:eastAsia="楷体" w:hAnsi="楷体"/>
-          <w:sz w:val="24"/>
-          <w:szCs w:val="24"/>
-          <w:shd w:val="pct15" w:color="auto" w:fill="FFFFFF"/>
-        </w:rPr>
-      </w:pPr>
-      <w:r>
-        <w:rPr>
-          <w:rFonts w:ascii="楷体" w:eastAsia="楷体" w:hAnsi="楷体" w:hint="eastAsia"/>
-          <w:sz w:val="24"/>
-          <w:szCs w:val="24"/>
-          <w:shd w:val="pct15" w:color="auto" w:fill="FFFFFF"/>
-        </w:rPr>
-        <w:t xml:space="preserve">　　第二大愿。愿我来世得菩提时。身如琉璃内外明彻净无瑕秽。光明广大</w:t>
-      </w:r>
-      <w:r>
-        <w:rPr>
-          <w:rFonts w:ascii="楷体" w:eastAsia="楷体" w:hAnsi="楷体" w:hint="eastAsia"/>
-          <w:sz w:val="24"/>
-          <w:szCs w:val="24"/>
-          <w:shd w:val="pct15" w:color="auto" w:fill="FFFFFF"/>
-        </w:rPr>
-        <w:t>。</w:t>
-      </w:r>
-      <w:r>
-        <w:rPr>
-          <w:rFonts w:ascii="楷体" w:eastAsia="楷体" w:hAnsi="楷体" w:hint="eastAsia"/>
-          <w:sz w:val="24"/>
-          <w:szCs w:val="24"/>
-          <w:shd w:val="pct15" w:color="auto" w:fill="FFFFFF"/>
-        </w:rPr>
-        <w:t>功德巍巍。身善安住</w:t>
-      </w:r>
-      <w:r>
-        <w:rPr>
-          <w:rFonts w:ascii="楷体" w:eastAsia="楷体" w:hAnsi="楷体" w:hint="eastAsia"/>
-          <w:sz w:val="24"/>
-          <w:szCs w:val="24"/>
-          <w:shd w:val="pct15" w:color="auto" w:fill="FFFFFF"/>
-        </w:rPr>
-        <w:t>。</w:t>
-      </w:r>
-      <w:r>
-        <w:rPr>
-          <w:rFonts w:ascii="楷体" w:eastAsia="楷体" w:hAnsi="楷体" w:hint="eastAsia"/>
-          <w:sz w:val="24"/>
-          <w:szCs w:val="24"/>
-          <w:shd w:val="pct15" w:color="auto" w:fill="FFFFFF"/>
-        </w:rPr>
-        <w:t>焰网庄严过于日月。幽冥众生悉蒙开晓。随意所趣作诸事业。</w:t>
-      </w:r>
-    </w:p>
-    <w:p>
-      <w:pPr>
-        <w:rPr>
-          <w:rFonts w:ascii="楷体" w:eastAsia="楷体" w:hAnsi="楷体"/>
-          <w:sz w:val="24"/>
-          <w:szCs w:val="24"/>
-          <w:shd w:val="pct15" w:color="auto" w:fill="FFFFFF"/>
-        </w:rPr>
-      </w:pPr>
-      <w:r>
-        <w:rPr>
-          <w:rFonts w:ascii="楷体" w:eastAsia="楷体" w:hAnsi="楷体" w:hint="eastAsia"/>
-          <w:sz w:val="24"/>
-          <w:szCs w:val="24"/>
-          <w:shd w:val="pct15" w:color="auto" w:fill="FFFFFF"/>
-        </w:rPr>
-        <w:t xml:space="preserve">　　第三大愿。愿我来世得菩提时。以无量无边智慧方便。令诸有情皆得无尽所受用物。莫令众生有所乏少。</w:t>
-      </w:r>
-    </w:p>
-    <w:p>
-      <w:pPr>
-        <w:rPr>
-          <w:rFonts w:ascii="楷体" w:eastAsia="楷体" w:hAnsi="楷体"/>
-          <w:sz w:val="24"/>
-          <w:szCs w:val="24"/>
-          <w:shd w:val="pct15" w:color="auto" w:fill="FFFFFF"/>
-        </w:rPr>
-      </w:pPr>
-      <w:r>
-        <w:rPr>
-          <w:rFonts w:ascii="楷体" w:eastAsia="楷体" w:hAnsi="楷体" w:hint="eastAsia"/>
-          <w:sz w:val="24"/>
-          <w:szCs w:val="24"/>
-          <w:shd w:val="pct15" w:color="auto" w:fill="FFFFFF"/>
-        </w:rPr>
-        <w:t xml:space="preserve">　　第四大愿。</w:t>
-      </w:r>
-      <w:r>
-        <w:rPr>
-          <w:rFonts w:ascii="楷体" w:eastAsia="楷体" w:hAnsi="楷体" w:hint="eastAsia"/>
-          <w:sz w:val="24"/>
-          <w:szCs w:val="24"/>
-          <w:shd w:val="pct15" w:color="auto" w:fill="FFFFFF"/>
-        </w:rPr>
-        <w:t>愿我来世得菩提时。若诸有情行邪道者。悉令安住菩提道中。若行声闻</w:t>
-      </w:r>
-      <w:r>
-        <w:rPr>
-          <w:rFonts w:ascii="楷体" w:eastAsia="楷体" w:hAnsi="楷体" w:hint="eastAsia"/>
-          <w:sz w:val="24"/>
-          <w:szCs w:val="24"/>
-          <w:shd w:val="pct15" w:color="auto" w:fill="FFFFFF"/>
-        </w:rPr>
-        <w:t>独觉乘者。皆以大乘而安立之。</w:t>
-      </w:r>
-    </w:p>
-    <w:p>
-      <w:pPr>
-        <w:rPr>
-          <w:rFonts w:ascii="楷体" w:eastAsia="楷体" w:hAnsi="楷体"/>
-          <w:sz w:val="24"/>
-          <w:szCs w:val="24"/>
-          <w:shd w:val="pct15" w:color="auto" w:fill="FFFFFF"/>
-        </w:rPr>
-      </w:pPr>
-      <w:r>
-        <w:rPr>
-          <w:rFonts w:ascii="楷体" w:eastAsia="楷体" w:hAnsi="楷体" w:hint="eastAsia"/>
-          <w:sz w:val="24"/>
-          <w:szCs w:val="24"/>
-          <w:shd w:val="pct15" w:color="auto" w:fill="FFFFFF"/>
-        </w:rPr>
-        <w:t xml:space="preserve">　　第五大愿。愿我来世得菩提时。若有无量无边有情。于我法中修行梵行。一切皆令得不缺戒。具三聚戒。设有毁犯</w:t>
-      </w:r>
-      <w:r>
-        <w:rPr>
-          <w:rFonts w:ascii="楷体" w:eastAsia="楷体" w:hAnsi="楷体" w:hint="eastAsia"/>
-          <w:sz w:val="24"/>
-          <w:szCs w:val="24"/>
-          <w:shd w:val="pct15" w:color="auto" w:fill="FFFFFF"/>
-        </w:rPr>
-        <w:t>。</w:t>
-      </w:r>
-      <w:r>
-        <w:rPr>
-          <w:rFonts w:ascii="楷体" w:eastAsia="楷体" w:hAnsi="楷体" w:hint="eastAsia"/>
-          <w:sz w:val="24"/>
-          <w:szCs w:val="24"/>
-          <w:shd w:val="pct15" w:color="auto" w:fill="FFFFFF"/>
-        </w:rPr>
-        <w:t>闻我名已</w:t>
-      </w:r>
-      <w:r>
-        <w:rPr>
-          <w:rFonts w:ascii="楷体" w:eastAsia="楷体" w:hAnsi="楷体" w:hint="eastAsia"/>
-          <w:sz w:val="24"/>
-          <w:szCs w:val="24"/>
-          <w:shd w:val="pct15" w:color="auto" w:fill="FFFFFF"/>
-        </w:rPr>
-        <w:t>。</w:t>
-      </w:r>
-      <w:r>
-        <w:rPr>
-          <w:rFonts w:ascii="楷体" w:eastAsia="楷体" w:hAnsi="楷体" w:hint="eastAsia"/>
-          <w:sz w:val="24"/>
-          <w:szCs w:val="24"/>
-          <w:shd w:val="pct15" w:color="auto" w:fill="FFFFFF"/>
-        </w:rPr>
-        <w:t>还得清净不堕恶趣。</w:t>
-      </w:r>
-    </w:p>
-    <w:p>
-      <w:pPr>
-        <w:rPr>
-          <w:rFonts w:ascii="楷体" w:eastAsia="楷体" w:hAnsi="楷体"/>
-          <w:sz w:val="24"/>
-          <w:szCs w:val="24"/>
-          <w:shd w:val="pct15" w:color="auto" w:fill="FFFFFF"/>
-        </w:rPr>
-      </w:pPr>
-      <w:r>
-        <w:rPr>
-          <w:rFonts w:ascii="楷体" w:eastAsia="楷体" w:hAnsi="楷体" w:hint="eastAsia"/>
-          <w:sz w:val="24"/>
-          <w:szCs w:val="24"/>
-          <w:shd w:val="pct15" w:color="auto" w:fill="FFFFFF"/>
-        </w:rPr>
-        <w:t xml:space="preserve">　　第六大愿。愿我来世得菩提时。若诸有情其身下劣诸根不具。丑陋顽愚盲聋喑哑。挛躄背偻白癞癫狂。种种病苦。闻我名已</w:t>
-      </w:r>
-      <w:r>
-        <w:rPr>
-          <w:rFonts w:ascii="楷体" w:eastAsia="楷体" w:hAnsi="楷体" w:hint="eastAsia"/>
-          <w:sz w:val="24"/>
-          <w:szCs w:val="24"/>
-          <w:shd w:val="pct15" w:color="auto" w:fill="FFFFFF"/>
-        </w:rPr>
-        <w:t>。</w:t>
-      </w:r>
-      <w:r>
-        <w:rPr>
-          <w:rFonts w:ascii="楷体" w:eastAsia="楷体" w:hAnsi="楷体" w:hint="eastAsia"/>
-          <w:sz w:val="24"/>
-          <w:szCs w:val="24"/>
-          <w:shd w:val="pct15" w:color="auto" w:fill="FFFFFF"/>
-        </w:rPr>
-        <w:t>一切皆得端正黠慧。诸根完具无诸疾苦。</w:t>
-      </w:r>
-    </w:p>
-    <w:p>
-      <w:pPr>
-        <w:rPr>
-          <w:rFonts w:ascii="楷体" w:eastAsia="楷体" w:hAnsi="楷体"/>
-          <w:sz w:val="24"/>
-          <w:szCs w:val="24"/>
-          <w:shd w:val="pct15" w:color="auto" w:fill="FFFFFF"/>
-        </w:rPr>
-      </w:pPr>
-      <w:r>
-        <w:rPr>
-          <w:rFonts w:ascii="楷体" w:eastAsia="楷体" w:hAnsi="楷体" w:hint="eastAsia"/>
-          <w:sz w:val="24"/>
-          <w:szCs w:val="24"/>
-          <w:shd w:val="pct15" w:color="auto" w:fill="FFFFFF"/>
-        </w:rPr>
-        <w:t xml:space="preserve">　　第七大愿。愿我来世得菩提时。若诸有情众病逼切</w:t>
-      </w:r>
-      <w:r>
-        <w:rPr>
-          <w:rFonts w:ascii="楷体" w:eastAsia="楷体" w:hAnsi="楷体" w:hint="eastAsia"/>
-          <w:sz w:val="24"/>
-          <w:szCs w:val="24"/>
-          <w:shd w:val="pct15" w:color="auto" w:fill="FFFFFF"/>
-        </w:rPr>
-        <w:t>。无救无归</w:t>
-      </w:r>
-      <w:r>
-        <w:rPr>
-          <w:rFonts w:ascii="楷体" w:eastAsia="楷体" w:hAnsi="楷体" w:hint="eastAsia"/>
-          <w:sz w:val="24"/>
-          <w:szCs w:val="24"/>
-          <w:shd w:val="pct15" w:color="auto" w:fill="FFFFFF"/>
-        </w:rPr>
-        <w:t>无医无药</w:t>
-      </w:r>
-      <w:r>
-        <w:rPr>
-          <w:rFonts w:ascii="楷体" w:eastAsia="楷体" w:hAnsi="楷体" w:hint="eastAsia"/>
-          <w:sz w:val="24"/>
-          <w:szCs w:val="24"/>
-          <w:shd w:val="pct15" w:color="auto" w:fill="FFFFFF"/>
-        </w:rPr>
-        <w:t>。</w:t>
-      </w:r>
-      <w:r>
-        <w:rPr>
-          <w:rFonts w:ascii="楷体" w:eastAsia="楷体" w:hAnsi="楷体" w:hint="eastAsia"/>
-          <w:sz w:val="24"/>
-          <w:szCs w:val="24"/>
-          <w:shd w:val="pct15" w:color="auto" w:fill="FFFFFF"/>
-        </w:rPr>
-        <w:t>无亲无家贫穷多苦。我之名号一经其耳。众病悉</w:t>
-      </w:r>
-      <w:r>
-        <w:rPr>
-          <w:rFonts w:ascii="楷体" w:eastAsia="楷体" w:hAnsi="楷体" w:hint="eastAsia"/>
-          <w:sz w:val="24"/>
-          <w:szCs w:val="24"/>
-          <w:shd w:val="pct15" w:color="auto" w:fill="FFFFFF"/>
-        </w:rPr>
-        <w:t>除</w:t>
-      </w:r>
-      <w:r>
-        <w:rPr>
-          <w:rFonts w:ascii="楷体" w:eastAsia="楷体" w:hAnsi="楷体" w:hint="eastAsia"/>
-          <w:sz w:val="24"/>
-          <w:szCs w:val="24"/>
-          <w:shd w:val="pct15" w:color="auto" w:fill="FFFFFF"/>
-        </w:rPr>
-        <w:t>身心安乐。家属资具悉皆丰足。乃至证得无上菩提。</w:t>
-      </w:r>
-    </w:p>
-    <w:p>
-      <w:pPr>
-        <w:rPr>
-          <w:rFonts w:ascii="楷体" w:eastAsia="楷体" w:hAnsi="楷体"/>
-          <w:sz w:val="24"/>
-          <w:szCs w:val="24"/>
-          <w:shd w:val="pct15" w:color="auto" w:fill="FFFFFF"/>
-        </w:rPr>
-      </w:pPr>
-      <w:r>
-        <w:rPr>
-          <w:rFonts w:ascii="楷体" w:eastAsia="楷体" w:hAnsi="楷体" w:hint="eastAsia"/>
-          <w:sz w:val="24"/>
-          <w:szCs w:val="24"/>
-          <w:shd w:val="pct15" w:color="auto" w:fill="FFFFFF"/>
-        </w:rPr>
-        <w:t xml:space="preserve">　　第八大愿。愿我来世得菩提时。若有女人为女百恶之所逼恼。极生厌离愿舍女身。闻我名已</w:t>
-      </w:r>
-      <w:r>
-        <w:rPr>
-          <w:rFonts w:ascii="楷体" w:eastAsia="楷体" w:hAnsi="楷体" w:hint="eastAsia"/>
-          <w:sz w:val="24"/>
-          <w:szCs w:val="24"/>
-          <w:shd w:val="pct15" w:color="auto" w:fill="FFFFFF"/>
-        </w:rPr>
-        <w:t>。</w:t>
-      </w:r>
-      <w:r>
-        <w:rPr>
-          <w:rFonts w:ascii="楷体" w:eastAsia="楷体" w:hAnsi="楷体" w:hint="eastAsia"/>
-          <w:sz w:val="24"/>
-          <w:szCs w:val="24"/>
-          <w:shd w:val="pct15" w:color="auto" w:fill="FFFFFF"/>
-        </w:rPr>
-        <w:t>一切皆得转女成男具丈夫相。乃至证得无上菩提。</w:t>
-      </w:r>
-    </w:p>
-    <w:p>
-      <w:pPr>
-        <w:rPr>
-          <w:rFonts w:ascii="楷体" w:eastAsia="楷体" w:hAnsi="楷体"/>
-          <w:sz w:val="24"/>
-          <w:szCs w:val="24"/>
-          <w:shd w:val="pct15" w:color="auto" w:fill="FFFFFF"/>
-        </w:rPr>
-      </w:pPr>
-      <w:r>
-        <w:rPr>
-          <w:rFonts w:ascii="楷体" w:eastAsia="楷体" w:hAnsi="楷体" w:hint="eastAsia"/>
-          <w:sz w:val="24"/>
-          <w:szCs w:val="24"/>
-          <w:shd w:val="pct15" w:color="auto" w:fill="FFFFFF"/>
-        </w:rPr>
-        <w:t xml:space="preserve">　　第九大愿。愿我来世得菩提时。令诸有情出魔罥网。解脱一切外道缠缚。若堕种种恶见稠林。皆当引摄置于正见。渐令修习诸菩萨行。速证无上正等菩提。</w:t>
-      </w:r>
-    </w:p>
-    <w:p>
-      <w:pPr>
-        <w:rPr>
-          <w:rFonts w:ascii="楷体" w:eastAsia="楷体" w:hAnsi="楷体"/>
-          <w:sz w:val="24"/>
-          <w:szCs w:val="24"/>
-          <w:shd w:val="pct15" w:color="auto" w:fill="FFFFFF"/>
-        </w:rPr>
-      </w:pPr>
-      <w:r>
-        <w:rPr>
-          <w:rFonts w:ascii="楷体" w:eastAsia="楷体" w:hAnsi="楷体" w:hint="eastAsia"/>
-          <w:sz w:val="24"/>
-          <w:szCs w:val="24"/>
-          <w:shd w:val="pct15" w:color="auto" w:fill="FFFFFF"/>
-        </w:rPr>
-        <w:t xml:space="preserve">　　第十大愿。愿我来世得菩提时。若诸有情王法所录</w:t>
-      </w:r>
-      <w:r>
-        <w:rPr>
-          <w:rFonts w:ascii="楷体" w:eastAsia="楷体" w:hAnsi="楷体" w:hint="eastAsia"/>
-          <w:sz w:val="24"/>
-          <w:szCs w:val="24"/>
-          <w:shd w:val="pct15" w:color="auto" w:fill="FFFFFF"/>
-        </w:rPr>
-        <w:t>缧缚鞭挞</w:t>
-      </w:r>
-      <w:r>
-        <w:rPr>
-          <w:rFonts w:ascii="楷体" w:eastAsia="楷体" w:hAnsi="楷体" w:hint="eastAsia"/>
-          <w:sz w:val="24"/>
-          <w:szCs w:val="24"/>
-          <w:shd w:val="pct15" w:color="auto" w:fill="FFFFFF"/>
-        </w:rPr>
-        <w:t>。</w:t>
-      </w:r>
-      <w:r>
-        <w:rPr>
-          <w:rFonts w:ascii="楷体" w:eastAsia="楷体" w:hAnsi="楷体" w:hint="eastAsia"/>
-          <w:sz w:val="24"/>
-          <w:szCs w:val="24"/>
-          <w:shd w:val="pct15" w:color="auto" w:fill="FFFFFF"/>
-        </w:rPr>
-        <w:t>系闭牢狱或当刑戮。及余无量灾难凌辱。悲愁煎迫身心受苦。若闻我名。以我福德威神力故。皆得解脱一切忧苦。</w:t>
-      </w:r>
-    </w:p>
-    <w:p>
-      <w:pPr>
-        <w:rPr>
-          <w:rFonts w:ascii="楷体" w:eastAsia="楷体" w:hAnsi="楷体"/>
-          <w:sz w:val="24"/>
-          <w:szCs w:val="24"/>
-          <w:shd w:val="pct15" w:color="auto" w:fill="FFFFFF"/>
-        </w:rPr>
-      </w:pPr>
-      <w:r>
-        <w:rPr>
-          <w:rFonts w:ascii="楷体" w:eastAsia="楷体" w:hAnsi="楷体" w:hint="eastAsia"/>
-          <w:sz w:val="24"/>
-          <w:szCs w:val="24"/>
-          <w:shd w:val="pct15" w:color="auto" w:fill="FFFFFF"/>
-        </w:rPr>
-        <w:t xml:space="preserve">　　第十一大愿。愿我来世得菩提时。若诸有情饥渴所恼。为求食故造诸恶业。得闻我名专念受持。我当先以上妙饮食饱足其身。后以法味毕竟安乐而建立之。</w:t>
-      </w:r>
-    </w:p>
-    <w:p>
-      <w:pPr>
-        <w:rPr>
-          <w:rFonts w:ascii="楷体" w:eastAsia="楷体" w:hAnsi="楷体"/>
-          <w:sz w:val="24"/>
-          <w:szCs w:val="24"/>
-          <w:shd w:val="pct15" w:color="auto" w:fill="FFFFFF"/>
-        </w:rPr>
-      </w:pPr>
-      <w:r>
-        <w:rPr>
-          <w:rFonts w:ascii="楷体" w:eastAsia="楷体" w:hAnsi="楷体" w:hint="eastAsia"/>
-          <w:sz w:val="24"/>
-          <w:szCs w:val="24"/>
-          <w:shd w:val="pct15" w:color="auto" w:fill="FFFFFF"/>
-        </w:rPr>
-        <w:t xml:space="preserve">　　第十二大愿。愿我来世得菩提时。若诸有情贫无衣服。蚊虻寒热昼夜逼恼。若闻我名专念受持。如其所好即得种种上妙衣服。亦得一切宝庄严具。华鬘涂香</w:t>
-      </w:r>
-      <w:r>
-        <w:rPr>
-          <w:rFonts w:ascii="楷体" w:eastAsia="楷体" w:hAnsi="楷体" w:hint="eastAsia"/>
-          <w:sz w:val="24"/>
-          <w:szCs w:val="24"/>
-          <w:shd w:val="pct15" w:color="auto" w:fill="FFFFFF"/>
-        </w:rPr>
-        <w:lastRenderedPageBreak/>
-        <w:t>鼓乐众伎。随心所玩皆令满足。</w:t>
-      </w:r>
-    </w:p>
-    <w:p>
-      <w:pPr>
-        <w:rPr>
-          <w:rFonts w:ascii="楷体" w:eastAsia="楷体" w:hAnsi="楷体"/>
-          <w:sz w:val="24"/>
-          <w:szCs w:val="24"/>
-          <w:shd w:val="pct15" w:color="auto" w:fill="FFFFFF"/>
-        </w:rPr>
-      </w:pPr>
-      <w:r>
-        <w:rPr>
-          <w:rFonts w:ascii="楷体" w:eastAsia="楷体" w:hAnsi="楷体" w:hint="eastAsia"/>
-          <w:sz w:val="24"/>
-          <w:szCs w:val="24"/>
-          <w:shd w:val="pct15" w:color="auto" w:fill="FFFFFF"/>
-        </w:rPr>
-        <w:t xml:space="preserve">　　曼殊室利。是为彼世尊药师琉璃光如来应</w:t>
-      </w:r>
-      <w:r>
-        <w:rPr>
-          <w:rFonts w:ascii="楷体" w:eastAsia="楷体" w:hAnsi="楷体" w:hint="eastAsia"/>
-          <w:sz w:val="24"/>
-          <w:szCs w:val="24"/>
-          <w:shd w:val="pct15" w:color="auto" w:fill="FFFFFF"/>
-        </w:rPr>
-        <w:t>正等觉</w:t>
-      </w:r>
-      <w:r>
-        <w:rPr>
-          <w:rFonts w:ascii="楷体" w:eastAsia="楷体" w:hAnsi="楷体" w:hint="eastAsia"/>
-          <w:sz w:val="24"/>
-          <w:szCs w:val="24"/>
-          <w:shd w:val="pct15" w:color="auto" w:fill="FFFFFF"/>
-        </w:rPr>
-        <w:t>行菩萨道时所发十二微妙上愿。</w:t>
-      </w:r>
-    </w:p>
-    <w:p>
-      <w:pPr>
-        <w:rPr>
-          <w:rFonts w:ascii="楷体" w:eastAsia="楷体" w:hAnsi="楷体"/>
-          <w:sz w:val="24"/>
-          <w:szCs w:val="24"/>
-          <w:shd w:val="pct15" w:color="auto" w:fill="FFFFFF"/>
-        </w:rPr>
-      </w:pPr>
-      <w:r>
-        <w:rPr>
-          <w:rFonts w:ascii="楷体" w:eastAsia="楷体" w:hAnsi="楷体" w:hint="eastAsia"/>
-          <w:sz w:val="24"/>
-          <w:szCs w:val="24"/>
-          <w:shd w:val="pct15" w:color="auto" w:fill="FFFFFF"/>
-        </w:rPr>
-        <w:t xml:space="preserve">　　复次曼殊室利。彼世</w:t>
-      </w:r>
-      <w:r>
-        <w:rPr>
-          <w:rFonts w:ascii="楷体" w:eastAsia="楷体" w:hAnsi="楷体" w:hint="eastAsia"/>
-          <w:sz w:val="24"/>
-          <w:szCs w:val="24"/>
-          <w:shd w:val="pct15" w:color="auto" w:fill="FFFFFF"/>
-        </w:rPr>
-        <w:t>尊药师琉璃光如来行菩萨道时。所发大愿及彼佛土功德庄严。我若一劫</w:t>
-      </w:r>
-      <w:r>
-        <w:rPr>
-          <w:rFonts w:ascii="楷体" w:eastAsia="楷体" w:hAnsi="楷体" w:hint="eastAsia"/>
-          <w:sz w:val="24"/>
-          <w:szCs w:val="24"/>
-          <w:shd w:val="pct15" w:color="auto" w:fill="FFFFFF"/>
-        </w:rPr>
-        <w:t>若一劫余说不能尽。然彼佛土一向清净无有女人。亦无恶趣及苦音声。琉璃为地金绳界道。城阙宫阁轩窗罗网皆七宝成。亦如西方极乐世界。功德庄严等无差别。于其国中有二菩萨摩诃萨。一名日光遍照。二名月光遍照。是彼无量无数菩萨众之上首。悉能持彼世尊药师琉璃光如来正法宝藏。是故曼殊室利。诸有信心善男子善女人等。应当愿生彼佛世界。</w:t>
-      </w:r>
-    </w:p>
-    <w:p>
-      <w:pPr>
-        <w:rPr>
-          <w:rFonts w:ascii="楷体" w:eastAsia="楷体" w:hAnsi="楷体"/>
-          <w:sz w:val="24"/>
-          <w:szCs w:val="24"/>
-          <w:shd w:val="pct15" w:color="auto" w:fill="FFFFFF"/>
-        </w:rPr>
-      </w:pPr>
-      <w:r>
-        <w:rPr>
-          <w:rFonts w:ascii="楷体" w:eastAsia="楷体" w:hAnsi="楷体" w:hint="eastAsia"/>
-          <w:sz w:val="24"/>
-          <w:szCs w:val="24"/>
-          <w:shd w:val="pct15" w:color="auto" w:fill="FFFFFF"/>
-        </w:rPr>
-        <w:t xml:space="preserve">　　尔时世尊复告曼殊师利童子言。曼殊室利。有诸众生不识善恶。唯怀贪吝不知布施及施果报。愚痴无智阙于信根。多聚财宝勤加守护。见乞者来其心不喜。设不获已而行施时。如割身肉深生痛惜。复有无量悭贪有情积集资财。于其自身尚不受用。何况能与父母妻子奴婢作使及来乞者。彼诸有情从</w:t>
-      </w:r>
-      <w:r>
-        <w:rPr>
-          <w:rFonts w:ascii="楷体" w:eastAsia="楷体" w:hAnsi="楷体" w:hint="eastAsia"/>
-          <w:sz w:val="24"/>
-          <w:szCs w:val="24"/>
-          <w:shd w:val="pct15" w:color="auto" w:fill="FFFFFF"/>
-        </w:rPr>
-        <w:t>此命终。生饿鬼界或傍生趣。由昔人间曾得暂闻药师琉璃光如来名故。今在恶趣</w:t>
-      </w:r>
-      <w:r>
-        <w:rPr>
-          <w:rFonts w:ascii="楷体" w:eastAsia="楷体" w:hAnsi="楷体" w:hint="eastAsia"/>
-          <w:sz w:val="24"/>
-          <w:szCs w:val="24"/>
-          <w:shd w:val="pct15" w:color="auto" w:fill="FFFFFF"/>
-        </w:rPr>
-        <w:t>暂得忆念彼如来名。即于念时从彼处没还生人中。得宿命念</w:t>
-      </w:r>
-      <w:r>
-        <w:rPr>
-          <w:rFonts w:ascii="楷体" w:eastAsia="楷体" w:hAnsi="楷体" w:hint="eastAsia"/>
-          <w:sz w:val="24"/>
-          <w:szCs w:val="24"/>
-          <w:shd w:val="pct15" w:color="auto" w:fill="FFFFFF"/>
-        </w:rPr>
-        <w:t>。</w:t>
-      </w:r>
-      <w:r>
-        <w:rPr>
-          <w:rFonts w:ascii="楷体" w:eastAsia="楷体" w:hAnsi="楷体" w:hint="eastAsia"/>
-          <w:sz w:val="24"/>
-          <w:szCs w:val="24"/>
-          <w:shd w:val="pct15" w:color="auto" w:fill="FFFFFF"/>
-        </w:rPr>
-        <w:t>畏恶趣苦</w:t>
-      </w:r>
-      <w:r>
-        <w:rPr>
-          <w:rFonts w:ascii="楷体" w:eastAsia="楷体" w:hAnsi="楷体" w:hint="eastAsia"/>
-          <w:sz w:val="24"/>
-          <w:szCs w:val="24"/>
-          <w:shd w:val="pct15" w:color="auto" w:fill="FFFFFF"/>
-        </w:rPr>
-        <w:t>。</w:t>
-      </w:r>
-      <w:r>
-        <w:rPr>
-          <w:rFonts w:ascii="楷体" w:eastAsia="楷体" w:hAnsi="楷体" w:hint="eastAsia"/>
-          <w:sz w:val="24"/>
-          <w:szCs w:val="24"/>
-          <w:shd w:val="pct15" w:color="auto" w:fill="FFFFFF"/>
-        </w:rPr>
-        <w:t>不乐欲乐。好行惠施赞叹施者。一切所有悉无贪惜。渐次尚能以头目手足血肉身分施来求者。况余财物。</w:t>
-      </w:r>
-    </w:p>
-    <w:p>
-      <w:pPr>
-        <w:rPr>
-          <w:rFonts w:ascii="楷体" w:eastAsia="楷体" w:hAnsi="楷体"/>
-          <w:sz w:val="24"/>
-          <w:szCs w:val="24"/>
-          <w:shd w:val="pct15" w:color="auto" w:fill="FFFFFF"/>
-        </w:rPr>
-      </w:pPr>
-      <w:r>
-        <w:rPr>
-          <w:rFonts w:ascii="楷体" w:eastAsia="楷体" w:hAnsi="楷体" w:hint="eastAsia"/>
-          <w:sz w:val="24"/>
-          <w:szCs w:val="24"/>
-          <w:shd w:val="pct15" w:color="auto" w:fill="FFFFFF"/>
-        </w:rPr>
-        <w:t xml:space="preserve">　　复次曼殊室利。若诸有情虽于如来受诸学处而破尸罗。有虽不破尸罗而破轨则。有于尸罗轨则虽得不坏然毁正见。有虽不毁正见而弃多闻</w:t>
-      </w:r>
-      <w:r>
-        <w:rPr>
-          <w:rFonts w:ascii="楷体" w:eastAsia="楷体" w:hAnsi="楷体" w:hint="eastAsia"/>
-          <w:sz w:val="24"/>
-          <w:szCs w:val="24"/>
-          <w:shd w:val="pct15" w:color="auto" w:fill="FFFFFF"/>
-        </w:rPr>
-        <w:t>。</w:t>
-      </w:r>
-      <w:r>
-        <w:rPr>
-          <w:rFonts w:ascii="楷体" w:eastAsia="楷体" w:hAnsi="楷体" w:hint="eastAsia"/>
-          <w:sz w:val="24"/>
-          <w:szCs w:val="24"/>
-          <w:shd w:val="pct15" w:color="auto" w:fill="FFFFFF"/>
-        </w:rPr>
-        <w:t>于佛所说契经深义不能解了。有虽多闻而增上慢。由增上慢覆蔽心故。自是非他</w:t>
-      </w:r>
-      <w:r>
-        <w:rPr>
-          <w:rFonts w:ascii="楷体" w:eastAsia="楷体" w:hAnsi="楷体" w:hint="eastAsia"/>
-          <w:sz w:val="24"/>
-          <w:szCs w:val="24"/>
-          <w:shd w:val="pct15" w:color="auto" w:fill="FFFFFF"/>
-        </w:rPr>
-        <w:t>。</w:t>
-      </w:r>
-      <w:r>
-        <w:rPr>
-          <w:rFonts w:ascii="楷体" w:eastAsia="楷体" w:hAnsi="楷体" w:hint="eastAsia"/>
-          <w:sz w:val="24"/>
-          <w:szCs w:val="24"/>
-          <w:shd w:val="pct15" w:color="auto" w:fill="FFFFFF"/>
-        </w:rPr>
-        <w:t>嫌谤正法为魔伴党。如是愚人自行邪见。复令无量俱胝有情堕大险坑。此诸有情应于地狱傍生鬼趣流转无穷。若得闻此药师琉璃光如来名号。便舍恶行修诸善法不堕恶趣。设有不能舍诸恶行、修行善法，堕恶趣者。以彼如来本愿威力。令其现前暂闻名号。从彼命终还生人趣。得正见精进善调意乐。便能舍家趣于非家。如来法中受持学处无有毁犯。正见多闻解甚深义。离增上慢</w:t>
-      </w:r>
-      <w:r>
-        <w:rPr>
-          <w:rFonts w:ascii="楷体" w:eastAsia="楷体" w:hAnsi="楷体" w:hint="eastAsia"/>
-          <w:sz w:val="24"/>
-          <w:szCs w:val="24"/>
-          <w:shd w:val="pct15" w:color="auto" w:fill="FFFFFF"/>
-        </w:rPr>
-        <w:t>。</w:t>
-      </w:r>
-      <w:r>
-        <w:rPr>
-          <w:rFonts w:ascii="楷体" w:eastAsia="楷体" w:hAnsi="楷体" w:hint="eastAsia"/>
-          <w:sz w:val="24"/>
-          <w:szCs w:val="24"/>
-          <w:shd w:val="pct15" w:color="auto" w:fill="FFFFFF"/>
-        </w:rPr>
-        <w:t>不谤正法不为魔伴。渐次修行诸菩萨行速得圆满。</w:t>
-      </w:r>
-    </w:p>
-    <w:p>
-      <w:pPr>
-        <w:rPr>
-          <w:rFonts w:ascii="楷体" w:eastAsia="楷体" w:hAnsi="楷体"/>
-          <w:sz w:val="24"/>
-          <w:szCs w:val="24"/>
-          <w:shd w:val="pct15" w:color="auto" w:fill="FFFFFF"/>
-        </w:rPr>
-      </w:pPr>
-      <w:r>
-        <w:rPr>
-          <w:rFonts w:ascii="楷体" w:eastAsia="楷体" w:hAnsi="楷体" w:hint="eastAsia"/>
-          <w:sz w:val="24"/>
-          <w:szCs w:val="24"/>
-          <w:shd w:val="pct15" w:color="auto" w:fill="FFFFFF"/>
-        </w:rPr>
-        <w:t xml:space="preserve">　　复次曼殊室利。若诸有情悭贪嫉妒自赞毁他。当堕三恶趣中无量千岁受诸剧苦。受剧苦已。从彼命终来生人间作牛马驼驴。恒被鞭挞饥渴逼恼。又常负重随路而行。或得为人生居下贱。作人奴婢受他驱役恒不自在。若昔人中曾闻世尊药师琉璃光如来名号。由此善因今复忆念至心归依。以佛神力众苦解脱。诸根聪利智慧多闻。恒求胜法常遇善友。永断魔罥破无明</w:t>
-      </w:r>
-      <w:r>
-        <w:rPr>
-          <w:rFonts w:ascii="楷体" w:eastAsia="楷体" w:hAnsi="楷体"/>
-          <w:sz w:val="24"/>
-          <w:szCs w:val="24"/>
-          <w:shd w:val="pct15" w:color="auto" w:fill="FFFFFF"/>
-        </w:rPr>
-        <w:t>[穀-禾+卵]竭烦恼河。解脱一切生老病死忧愁苦恼。</w:t>
+          <w:rFonts w:ascii="楷体" w:eastAsia="楷体" w:hAnsi="楷体"/>
+          <w:sz w:val="24"/>
+          <w:szCs w:val="24"/>
+          <w:shd w:val="pct15" w:color="auto" w:fill="FFFFFF"/>
+        </w:rPr>
+        <w:t>竭烦恼河。解脱一切生老病死忧愁苦恼。</w:t>
       </w:r>
     </w:p>
     <w:p>

</xml_diff>